<commit_message>
feat: update travel control and hmi specifications in v2 docx and handoff
</commit_message>
<xml_diff>
--- a/docs/Spec/Isoloader MJ35 Specifications-v2.docx
+++ b/docs/Spec/Isoloader MJ35 Specifications-v2.docx
@@ -1505,7 +1505,7 @@
               <w:rPr>
                 <w:rFonts w:ascii="Calibri" w:hAnsi="Calibri"/>
               </w:rPr>
-              <w:t>Touchscreen display (HMI) for vehicle telemetry, including battery state of charge (SOC), motor &amp; controller temperatures, system diagnostic codes, steering mode, and spreader status (twistlocks locked/unlocked, spreader length)</w:t>
+              <w:t>Touchscreen display (HMI) for vehicle telemetry, including battery state of charge (SOC), system diagnostic codes, steering mode, and spreader status (twistlocks locked/unlocked, spreader length). (Note: Motor and controller temperatures are not displayed on HMI)</w:t>
             </w:r>
           </w:p>
         </w:tc>
@@ -1587,7 +1587,37 @@
               <w:rPr>
                 <w:rFonts w:ascii="Calibri" w:hAnsi="Calibri"/>
               </w:rPr>
-              <w:t>Scroll button on Joystick Left</w:t>
+              <w:t>Scroll button on Joystick Right</w:t>
+            </w:r>
+          </w:p>
+        </w:tc>
+      </w:tr>
+      <w:tr>
+        <w:tc>
+          <w:tcPr>
+            <w:tcW w:type="dxa" w:w="2785"/>
+          </w:tcPr>
+          <w:p>
+            <w:r/>
+            <w:r>
+              <w:rPr>
+                <w:rFonts w:ascii="Calibri" w:hAnsi="Calibri"/>
+              </w:rPr>
+              <w:t>Travel control</w:t>
+            </w:r>
+          </w:p>
+        </w:tc>
+        <w:tc>
+          <w:tcPr>
+            <w:tcW w:type="dxa" w:w="8005"/>
+          </w:tcPr>
+          <w:p>
+            <w:r/>
+            <w:r>
+              <w:rPr>
+                <w:rFonts w:ascii="Calibri" w:hAnsi="Calibri"/>
+              </w:rPr>
+              <w:t>Joystick Left (Y-axis): Push forward to travel Forward, pull backward to travel Reverse</w:t>
             </w:r>
           </w:p>
         </w:tc>

</xml_diff>

<commit_message>
feat: simplify drive, steer, and lift motor specifications in v2 docx and handoff
</commit_message>
<xml_diff>
--- a/docs/Spec/Isoloader MJ35 Specifications-v2.docx
+++ b/docs/Spec/Isoloader MJ35 Specifications-v2.docx
@@ -466,8 +466,12 @@
                 <w:color w:val="FF0000"/>
               </w:rPr>
             </w:pPr>
-            <w:r>
-              <w:t>Electric, 4x Electrical Motors</w:t>
+            <w:r/>
+            <w:r>
+              <w:rPr>
+                <w:rFonts w:ascii="Calibri" w:hAnsi="Calibri"/>
+              </w:rPr>
+              <w:t>4x Electric Motors with integrated electric brakes</w:t>
             </w:r>
           </w:p>
         </w:tc>
@@ -539,7 +543,7 @@
               <w:rPr>
                 <w:rFonts w:ascii="Calibri" w:hAnsi="Calibri"/>
               </w:rPr>
-              <w:t>4 Wheel steer, ±45° (up to ±92° in lateral mode)</w:t>
+              <w:t>4 Wheel steer driven by 4 electric motors, ±45° (up to ±92° in lateral mode)</w:t>
             </w:r>
           </w:p>
         </w:tc>
@@ -879,7 +883,7 @@
               <w:rPr>
                 <w:rFonts w:ascii="Calibri" w:hAnsi="Calibri"/>
               </w:rPr>
-              <w:t>AC Electric Motors (PMP ME240-110-ASRPM-125V) coupled to Planetary Gear Hubs (PMP PMC2000) - 4 Wheel Drive</w:t>
+              <w:t>AC Electric Motors coupled to Planetary Gear Hubs - 4 Wheel Drive</w:t>
             </w:r>
           </w:p>
         </w:tc>

</xml_diff>

<commit_message>
feat: add 8-hour continuous operating guarantee and detailed energy consumption in v2 docx and handoff
</commit_message>
<xml_diff>
--- a/docs/Spec/Isoloader MJ35 Specifications-v2.docx
+++ b/docs/Spec/Isoloader MJ35 Specifications-v2.docx
@@ -960,7 +960,7 @@
               <w:rPr>
                 <w:rFonts w:ascii="Calibri" w:hAnsi="Calibri"/>
               </w:rPr>
-              <w:t>CATL, 130 VDC nominal (114.52 kWh total capacity, 2x 57.26 kWh packs in series, 8 working hours)</w:t>
+              <w:t>CATL, 130 VDC nominal (114.52 kWh total capacity, 2x 57.26 kWh packs in series; designed for minimum 8 hours of continuous operation on a single charge under typical duty cycles)</w:t>
             </w:r>
           </w:p>
         </w:tc>
@@ -1001,7 +1001,7 @@
               <w:rPr>
                 <w:rFonts w:ascii="Calibri" w:hAnsi="Calibri"/>
               </w:rPr>
-              <w:t>~45 kWh/shift (ca. 0.34 kWh/cycle under normal operation with HVAC ON)</w:t>
+              <w:t>Traction: ~1.5 kWh/km (unladen) to ~3.5 kWh/km (laden); Hoist: ~0.15 kWh/cycle (20T lift/lower); Standby: ~3.7 kWh/h (with HVAC ON)</w:t>
             </w:r>
           </w:p>
         </w:tc>

</xml_diff>

<commit_message>
feat: add charging time row to v2 docx and handoff
</commit_message>
<xml_diff>
--- a/docs/Spec/Isoloader MJ35 Specifications-v2.docx
+++ b/docs/Spec/Isoloader MJ35 Specifications-v2.docx
@@ -968,19 +968,46 @@
       <w:tr>
         <w:tc>
           <w:tcPr>
-            <w:tcW w:w="2785" w:type="dxa"/>
-          </w:tcPr>
-          <w:p>
-            <w:pPr>
-              <w:rPr>
-                <w:color w:val="FF0000"/>
-              </w:rPr>
-            </w:pPr>
-            <w:r/>
-            <w:r>
-              <w:rPr>
-                <w:rFonts w:ascii="Calibri" w:hAnsi="Calibri"/>
-              </w:rPr>
+            <w:tcW w:type="dxa" w:w="2785"/>
+          </w:tcPr>
+          <w:p>
+            <w:r/>
+            <w:r>
+              <w:rPr>
+                <w:rFonts w:ascii="Calibri" w:hAnsi="Calibri"/>
+              </w:rPr>
+              <w:t>Charging Time (to 80% SOC)</w:t>
+            </w:r>
+          </w:p>
+        </w:tc>
+        <w:tc>
+          <w:tcPr>
+            <w:tcW w:type="dxa" w:w="8005"/>
+          </w:tcPr>
+          <w:p>
+            <w:r/>
+            <w:r>
+              <w:rPr>
+                <w:rFonts w:ascii="Calibri" w:hAnsi="Calibri"/>
+              </w:rPr>
+              <w:t>Approx. 4.5 to 6 hours with a 15–20 kW charger (from 10% SOC to 80% SOC)</w:t>
+            </w:r>
+          </w:p>
+        </w:tc>
+      </w:tr>
+      <w:tr>
+        <w:tc>
+          <w:tcPr>
+            <w:tcW w:w="2785" w:type="dxa"/>
+          </w:tcPr>
+          <w:p>
+            <w:pPr>
+              <w:rPr>
+                <w:color w:val="FF0000"/>
+              </w:rPr>
+            </w:pPr>
+            <w:r>
+              <w:rPr/>
               <w:t>Energy Consumption</w:t>
             </w:r>
           </w:p>
@@ -1017,12 +1044,13 @@
                 <w:color w:val="FF0000"/>
               </w:rPr>
             </w:pPr>
-            <w:r/>
-            <w:r>
-              <w:rPr>
-                <w:rFonts w:ascii="Calibri" w:hAnsi="Calibri"/>
-              </w:rPr>
-              <w:t>Regenerative Energy</w:t>
+            <w:r>
+              <w:rPr/>
+              <w:t xml:space="preserve">Regenerative </w:t>
+            </w:r>
+            <w:r>
+              <w:rPr/>
+              <w:t xml:space="preserve">Energy </w:t>
             </w:r>
           </w:p>
         </w:tc>
@@ -1052,11 +1080,8 @@
                 <w:color w:val="FF0000"/>
               </w:rPr>
             </w:pPr>
-            <w:r/>
-            <w:r>
-              <w:rPr>
-                <w:rFonts w:ascii="Calibri" w:hAnsi="Calibri"/>
-              </w:rPr>
+            <w:r>
+              <w:rPr/>
               <w:t>Warning Devices</w:t>
             </w:r>
           </w:p>

</xml_diff>

<commit_message>
feat: bms preparing power analysis and updated documents/handoff
</commit_message>
<xml_diff>
--- a/docs/Spec/Isoloader MJ35 Specifications-v2.docx
+++ b/docs/Spec/Isoloader MJ35 Specifications-v2.docx
@@ -207,45 +207,9 @@
             <w:tcW w:w="2785" w:type="dxa"/>
           </w:tcPr>
           <w:p>
-            <w:pPr>
-              <w:rPr>
-                <w:color w:val="FF0000"/>
-              </w:rPr>
-            </w:pPr>
             <w:r>
               <w:t>Travel Speed</w:t>
             </w:r>
-          </w:p>
-        </w:tc>
-        <w:tc>
-          <w:tcPr>
-            <w:tcW w:w="8005" w:type="dxa"/>
-          </w:tcPr>
-          <w:p>
-            <w:pPr>
-              <w:rPr>
-                <w:color w:val="FF0000"/>
-              </w:rPr>
-            </w:pPr>
-            <w:r/>
-            <w:r>
-              <w:rPr>
-                <w:rFonts w:ascii="Calibri" w:hAnsi="Calibri"/>
-              </w:rPr>
-              <w:t>Variable to 8 km/h (unladen)</w:t>
-            </w:r>
-          </w:p>
-        </w:tc>
-      </w:tr>
-      <w:tr>
-        <w:tc>
-          <w:tcPr>
-            <w:tcW w:w="2785" w:type="dxa"/>
-          </w:tcPr>
-          <w:p>
-            <w:r>
-              <w:t>Travel Speed</w:t>
-            </w:r>
             <w:r>
               <w:t xml:space="preserve"> Unload</w:t>
             </w:r>
@@ -313,7 +277,7 @@
               <w:rPr>
                 <w:color w:val="00B0F0"/>
               </w:rPr>
-              <w:t>6</w:t>
+              <w:t>5</w:t>
             </w:r>
             <w:r>
               <w:rPr>
@@ -466,7 +430,6 @@
                 <w:color w:val="FF0000"/>
               </w:rPr>
             </w:pPr>
-            <w:r/>
             <w:r>
               <w:rPr>
                 <w:rFonts w:ascii="Calibri" w:hAnsi="Calibri"/>
@@ -538,12 +501,23 @@
                 <w:color w:val="FF0000"/>
               </w:rPr>
             </w:pPr>
-            <w:r/>
-            <w:r>
-              <w:rPr>
-                <w:rFonts w:ascii="Calibri" w:hAnsi="Calibri"/>
-              </w:rPr>
-              <w:t>4 Wheel steer driven by 4 electric motors, ±45° (up to ±92° in lateral mode)</w:t>
+            <w:r>
+              <w:rPr>
+                <w:rFonts w:ascii="Calibri" w:hAnsi="Calibri"/>
+              </w:rPr>
+              <w:t>4 Wheel steer driven by 4 electric motors, ±45° (up to ±</w:t>
+            </w:r>
+            <w:r>
+              <w:rPr>
+                <w:rFonts w:ascii="Calibri" w:hAnsi="Calibri"/>
+              </w:rPr>
+              <w:t>90</w:t>
+            </w:r>
+            <w:r>
+              <w:rPr>
+                <w:rFonts w:ascii="Calibri" w:hAnsi="Calibri"/>
+              </w:rPr>
+              <w:t>° in lateral mode)</w:t>
             </w:r>
           </w:p>
         </w:tc>
@@ -580,7 +554,6 @@
                 <w:color w:val="FF0000"/>
               </w:rPr>
             </w:pPr>
-            <w:r/>
             <w:r>
               <w:rPr>
                 <w:rFonts w:ascii="Calibri" w:hAnsi="Calibri"/>
@@ -646,7 +619,6 @@
                 <w:color w:val="FF0000"/>
               </w:rPr>
             </w:pPr>
-            <w:r/>
             <w:r>
               <w:rPr>
                 <w:rFonts w:ascii="Calibri" w:hAnsi="Calibri"/>
@@ -734,7 +706,6 @@
                 <w:color w:val="FF0000"/>
               </w:rPr>
             </w:pPr>
-            <w:r/>
             <w:r>
               <w:rPr>
                 <w:rFonts w:ascii="Calibri" w:hAnsi="Calibri"/>
@@ -750,7 +721,6 @@
             <w:tcW w:w="2785" w:type="dxa"/>
           </w:tcPr>
           <w:p>
-            <w:r/>
             <w:r>
               <w:rPr>
                 <w:rFonts w:ascii="Calibri" w:hAnsi="Calibri"/>
@@ -770,7 +740,6 @@
                 <w:color w:val="FF0000"/>
               </w:rPr>
             </w:pPr>
-            <w:r/>
             <w:r>
               <w:rPr>
                 <w:rFonts w:ascii="Calibri" w:hAnsi="Calibri"/>
@@ -786,7 +755,6 @@
             <w:tcW w:w="2785" w:type="dxa"/>
           </w:tcPr>
           <w:p>
-            <w:r/>
             <w:r>
               <w:rPr>
                 <w:rFonts w:ascii="Calibri" w:hAnsi="Calibri"/>
@@ -806,7 +774,6 @@
                 <w:color w:val="FF0000"/>
               </w:rPr>
             </w:pPr>
-            <w:r/>
             <w:r>
               <w:rPr>
                 <w:rFonts w:ascii="Calibri" w:hAnsi="Calibri"/>
@@ -822,7 +789,6 @@
             <w:tcW w:w="2785" w:type="dxa"/>
           </w:tcPr>
           <w:p>
-            <w:r/>
             <w:r>
               <w:rPr>
                 <w:rFonts w:ascii="Calibri" w:hAnsi="Calibri"/>
@@ -840,25 +806,24 @@
               <w:rPr>
                 <w:noProof/>
                 <w:color w:val="FF0000"/>
-              </w:rPr>
-            </w:pPr>
-            <w:r/>
-            <w:r>
-              <w:rPr>
-                <w:rFonts w:ascii="Calibri" w:hAnsi="Calibri"/>
-              </w:rPr>
-              <w:t>Fail-safe spring-applied, electro-hydraulically released safety brake on motor shaft / gearbox input (requires 25–30 bar hydraulic pressure to release; brake automatically applies upon loss of pressure)</w:t>
-            </w:r>
-          </w:p>
-        </w:tc>
-      </w:tr>
-      <w:tr>
-        <w:tc>
-          <w:tcPr>
-            <w:tcW w:w="2785" w:type="dxa"/>
-          </w:tcPr>
-          <w:p>
-            <w:r/>
+                <w:lang w:val="vi-VN"/>
+              </w:rPr>
+            </w:pPr>
+            <w:r>
+              <w:rPr>
+                <w:rFonts w:ascii="Calibri" w:hAnsi="Calibri"/>
+              </w:rPr>
+              <w:t>Fail-safe spring-applied, electro-hydraulically released safety brake on motor shaft / gearbox input</w:t>
+            </w:r>
+          </w:p>
+        </w:tc>
+      </w:tr>
+      <w:tr>
+        <w:tc>
+          <w:tcPr>
+            <w:tcW w:w="2785" w:type="dxa"/>
+          </w:tcPr>
+          <w:p>
             <w:r>
               <w:rPr>
                 <w:rFonts w:ascii="Calibri" w:hAnsi="Calibri"/>
@@ -878,7 +843,6 @@
                 <w:color w:val="FF0000"/>
               </w:rPr>
             </w:pPr>
-            <w:r/>
             <w:r>
               <w:rPr>
                 <w:rFonts w:ascii="Calibri" w:hAnsi="Calibri"/>
@@ -894,7 +858,6 @@
             <w:tcW w:w="2785" w:type="dxa"/>
           </w:tcPr>
           <w:p>
-            <w:r/>
             <w:r>
               <w:rPr>
                 <w:rFonts w:ascii="Calibri" w:hAnsi="Calibri"/>
@@ -914,7 +877,6 @@
                 <w:color w:val="FF0000"/>
               </w:rPr>
             </w:pPr>
-            <w:r/>
             <w:r>
               <w:rPr>
                 <w:rFonts w:ascii="Calibri" w:hAnsi="Calibri"/>
@@ -935,7 +897,6 @@
                 <w:color w:val="FF0000"/>
               </w:rPr>
             </w:pPr>
-            <w:r/>
             <w:r>
               <w:rPr>
                 <w:rFonts w:ascii="Calibri" w:hAnsi="Calibri"/>
@@ -955,7 +916,6 @@
                 <w:color w:val="FF0000"/>
               </w:rPr>
             </w:pPr>
-            <w:r/>
             <w:r>
               <w:rPr>
                 <w:rFonts w:ascii="Calibri" w:hAnsi="Calibri"/>
@@ -968,10 +928,9 @@
       <w:tr>
         <w:tc>
           <w:tcPr>
-            <w:tcW w:type="dxa" w:w="2785"/>
-          </w:tcPr>
-          <w:p>
-            <w:r/>
+            <w:tcW w:w="2785" w:type="dxa"/>
+          </w:tcPr>
+          <w:p>
             <w:r>
               <w:rPr>
                 <w:rFonts w:ascii="Calibri" w:hAnsi="Calibri"/>
@@ -982,10 +941,9 @@
         </w:tc>
         <w:tc>
           <w:tcPr>
-            <w:tcW w:type="dxa" w:w="8005"/>
-          </w:tcPr>
-          <w:p>
-            <w:r/>
+            <w:tcW w:w="8005" w:type="dxa"/>
+          </w:tcPr>
+          <w:p>
             <w:r>
               <w:rPr>
                 <w:rFonts w:ascii="Calibri" w:hAnsi="Calibri"/>
@@ -1007,7 +965,6 @@
               </w:rPr>
             </w:pPr>
             <w:r>
-              <w:rPr/>
               <w:t>Energy Consumption</w:t>
             </w:r>
           </w:p>
@@ -1023,7 +980,6 @@
                 <w:bCs/>
               </w:rPr>
             </w:pPr>
-            <w:r/>
             <w:r>
               <w:rPr>
                 <w:rFonts w:ascii="Calibri" w:hAnsi="Calibri"/>
@@ -1045,11 +1001,9 @@
               </w:rPr>
             </w:pPr>
             <w:r>
-              <w:rPr/>
               <w:t xml:space="preserve">Regenerative </w:t>
             </w:r>
             <w:r>
-              <w:rPr/>
               <w:t xml:space="preserve">Energy </w:t>
             </w:r>
           </w:p>
@@ -1059,7 +1013,6 @@
             <w:tcW w:w="8005" w:type="dxa"/>
           </w:tcPr>
           <w:p>
-            <w:r/>
             <w:r>
               <w:rPr>
                 <w:rFonts w:ascii="Calibri" w:hAnsi="Calibri"/>
@@ -1081,7 +1034,6 @@
               </w:rPr>
             </w:pPr>
             <w:r>
-              <w:rPr/>
               <w:t>Warning Devices</w:t>
             </w:r>
           </w:p>
@@ -1097,7 +1049,6 @@
                 <w:bCs/>
               </w:rPr>
             </w:pPr>
-            <w:r/>
             <w:r>
               <w:rPr>
                 <w:rFonts w:ascii="Calibri" w:hAnsi="Calibri"/>
@@ -1118,7 +1069,6 @@
                 <w:color w:val="FF0000"/>
               </w:rPr>
             </w:pPr>
-            <w:r/>
             <w:r>
               <w:rPr>
                 <w:rFonts w:ascii="Calibri" w:hAnsi="Calibri"/>
@@ -1138,7 +1088,6 @@
                 <w:color w:val="FF0000"/>
               </w:rPr>
             </w:pPr>
-            <w:r/>
             <w:r>
               <w:rPr>
                 <w:rFonts w:ascii="Calibri" w:hAnsi="Calibri"/>
@@ -1175,7 +1124,6 @@
                 <w:color w:val="FF0000"/>
               </w:rPr>
             </w:pPr>
-            <w:r/>
             <w:r>
               <w:rPr>
                 <w:rFonts w:ascii="Calibri" w:hAnsi="Calibri"/>
@@ -1368,7 +1316,6 @@
                 <w:color w:val="FF0000"/>
               </w:rPr>
             </w:pPr>
-            <w:r/>
             <w:r>
               <w:rPr>
                 <w:rFonts w:ascii="Calibri" w:hAnsi="Calibri"/>
@@ -1389,7 +1336,6 @@
                 <w:color w:val="FF0000"/>
               </w:rPr>
             </w:pPr>
-            <w:r/>
             <w:r>
               <w:rPr>
                 <w:rFonts w:ascii="Calibri" w:hAnsi="Calibri"/>
@@ -1409,7 +1355,6 @@
                 <w:color w:val="FF0000"/>
               </w:rPr>
             </w:pPr>
-            <w:r/>
             <w:r>
               <w:rPr>
                 <w:rFonts w:ascii="Calibri" w:hAnsi="Calibri"/>
@@ -1487,7 +1432,6 @@
                 <w:color w:val="00B0F0"/>
               </w:rPr>
             </w:pPr>
-            <w:r/>
             <w:r>
               <w:rPr>
                 <w:rFonts w:ascii="Calibri" w:hAnsi="Calibri"/>
@@ -1509,7 +1453,6 @@
                 <w:color w:val="FF0000"/>
               </w:rPr>
             </w:pPr>
-            <w:r/>
             <w:r>
               <w:rPr>
                 <w:rFonts w:ascii="Calibri" w:hAnsi="Calibri"/>
@@ -1527,30 +1470,41 @@
               <w:rPr>
                 <w:noProof/>
                 <w:color w:val="FF0000"/>
-              </w:rPr>
-            </w:pPr>
-            <w:r/>
-            <w:r>
-              <w:rPr>
-                <w:rFonts w:ascii="Calibri" w:hAnsi="Calibri"/>
-              </w:rPr>
-              <w:t>Touchscreen display (HMI) for vehicle telemetry, including battery state of charge (SOC), system diagnostic codes, steering mode, and spreader status (twistlocks locked/unlocked, spreader length). (Note: Motor and controller temperatures are not displayed on HMI)</w:t>
-            </w:r>
-          </w:p>
-        </w:tc>
-      </w:tr>
-      <w:tr>
-        <w:tc>
-          <w:tcPr>
-            <w:tcW w:w="2785" w:type="dxa"/>
-          </w:tcPr>
-          <w:p>
-            <w:pPr>
-              <w:rPr>
-                <w:color w:val="FF0000"/>
-              </w:rPr>
-            </w:pPr>
-            <w:r/>
+                <w:lang w:val="vi-VN"/>
+              </w:rPr>
+            </w:pPr>
+            <w:r>
+              <w:rPr>
+                <w:rFonts w:ascii="Calibri" w:hAnsi="Calibri"/>
+              </w:rPr>
+              <w:t xml:space="preserve">Touchscreen display (HMI) for vehicle telemetry, including battery state of charge (SOC), system diagnostic codes, steering mode, and spreader status (twistlocks locked/unlocked, spreader </w:t>
+            </w:r>
+            <w:r>
+              <w:rPr>
+                <w:rFonts w:ascii="Calibri" w:hAnsi="Calibri"/>
+              </w:rPr>
+              <w:t>position</w:t>
+            </w:r>
+            <w:r>
+              <w:rPr>
+                <w:rFonts w:ascii="Calibri" w:hAnsi="Calibri"/>
+              </w:rPr>
+              <w:t>).</w:t>
+            </w:r>
+          </w:p>
+        </w:tc>
+      </w:tr>
+      <w:tr>
+        <w:tc>
+          <w:tcPr>
+            <w:tcW w:w="2785" w:type="dxa"/>
+          </w:tcPr>
+          <w:p>
+            <w:pPr>
+              <w:rPr>
+                <w:color w:val="FF0000"/>
+              </w:rPr>
+            </w:pPr>
             <w:r>
               <w:rPr>
                 <w:rFonts w:ascii="Calibri" w:hAnsi="Calibri"/>
@@ -1570,7 +1524,6 @@
                 <w:color w:val="FF0000"/>
               </w:rPr>
             </w:pPr>
-            <w:r/>
             <w:r>
               <w:rPr>
                 <w:rFonts w:ascii="Calibri" w:hAnsi="Calibri"/>
@@ -1591,7 +1544,6 @@
                 <w:color w:val="FF0000"/>
               </w:rPr>
             </w:pPr>
-            <w:r/>
             <w:r>
               <w:rPr>
                 <w:rFonts w:ascii="Calibri" w:hAnsi="Calibri"/>
@@ -1611,7 +1563,6 @@
                 <w:color w:val="FF0000"/>
               </w:rPr>
             </w:pPr>
-            <w:r/>
             <w:r>
               <w:rPr>
                 <w:rFonts w:ascii="Calibri" w:hAnsi="Calibri"/>
@@ -1624,10 +1575,9 @@
       <w:tr>
         <w:tc>
           <w:tcPr>
-            <w:tcW w:type="dxa" w:w="2785"/>
-          </w:tcPr>
-          <w:p>
-            <w:r/>
+            <w:tcW w:w="2785" w:type="dxa"/>
+          </w:tcPr>
+          <w:p>
             <w:r>
               <w:rPr>
                 <w:rFonts w:ascii="Calibri" w:hAnsi="Calibri"/>
@@ -1638,10 +1588,9 @@
         </w:tc>
         <w:tc>
           <w:tcPr>
-            <w:tcW w:type="dxa" w:w="8005"/>
-          </w:tcPr>
-          <w:p>
-            <w:r/>
+            <w:tcW w:w="8005" w:type="dxa"/>
+          </w:tcPr>
+          <w:p>
             <w:r>
               <w:rPr>
                 <w:rFonts w:ascii="Calibri" w:hAnsi="Calibri"/>
@@ -1662,7 +1611,6 @@
                 <w:color w:val="FF0000"/>
               </w:rPr>
             </w:pPr>
-            <w:r/>
             <w:r>
               <w:rPr>
                 <w:rFonts w:ascii="Calibri" w:hAnsi="Calibri"/>
@@ -1682,7 +1630,6 @@
                 <w:color w:val="FF0000"/>
               </w:rPr>
             </w:pPr>
-            <w:r/>
             <w:r>
               <w:rPr>
                 <w:rFonts w:ascii="Calibri" w:hAnsi="Calibri"/>
@@ -1703,7 +1650,6 @@
                 <w:color w:val="FF0000"/>
               </w:rPr>
             </w:pPr>
-            <w:r/>
             <w:r>
               <w:rPr>
                 <w:rFonts w:ascii="Calibri" w:hAnsi="Calibri"/>
@@ -1723,7 +1669,6 @@
                 <w:color w:val="FF0000"/>
               </w:rPr>
             </w:pPr>
-            <w:r/>
             <w:r>
               <w:rPr>
                 <w:rFonts w:ascii="Calibri" w:hAnsi="Calibri"/>

</xml_diff>

<commit_message>
feat: update travel test reports with speed conversions, 80% SOC runtime and restructure folder to try1
</commit_message>
<xml_diff>
--- a/docs/Spec/Isoloader MJ35 Specifications-v2.docx
+++ b/docs/Spec/Isoloader MJ35 Specifications-v2.docx
@@ -858,12 +858,14 @@
             <w:tcW w:w="2785" w:type="dxa"/>
           </w:tcPr>
           <w:p>
+            <w:proofErr w:type="spellStart"/>
             <w:r>
               <w:rPr>
                 <w:rFonts w:ascii="Calibri" w:hAnsi="Calibri"/>
               </w:rPr>
               <w:t>Tyres</w:t>
             </w:r>
+            <w:proofErr w:type="spellEnd"/>
           </w:p>
         </w:tc>
         <w:tc>
@@ -1053,7 +1055,13 @@
               <w:rPr>
                 <w:rFonts w:ascii="Calibri" w:hAnsi="Calibri"/>
               </w:rPr>
-              <w:t>2x Flashing amber travel beacons, 1x Audible backup beeper, Horn</w:t>
+              <w:t>4</w:t>
+            </w:r>
+            <w:r>
+              <w:rPr>
+                <w:rFonts w:ascii="Calibri" w:hAnsi="Calibri"/>
+              </w:rPr>
+              <w:t>x Flashing amber travel beacons, 1x Audible backup beeper, Horn</w:t>
             </w:r>
           </w:p>
         </w:tc>
@@ -1091,6 +1099,7 @@
             <w:r>
               <w:rPr>
                 <w:rFonts w:ascii="Calibri" w:hAnsi="Calibri"/>
+                <w:color w:val="EE0000"/>
               </w:rPr>
               <w:t>17 Tons (approx. with 6m-12m telescoping spreader)</w:t>
             </w:r>
@@ -1127,8 +1136,25 @@
             <w:r>
               <w:rPr>
                 <w:rFonts w:ascii="Calibri" w:hAnsi="Calibri"/>
-              </w:rPr>
-              <w:t>18 Tons (or 180 kN)</w:t>
+                <w:color w:val="EE0000"/>
+              </w:rPr>
+              <w:t xml:space="preserve">18 Tons (or 180 </w:t>
+            </w:r>
+            <w:proofErr w:type="spellStart"/>
+            <w:r>
+              <w:rPr>
+                <w:rFonts w:ascii="Calibri" w:hAnsi="Calibri"/>
+                <w:color w:val="EE0000"/>
+              </w:rPr>
+              <w:t>kN</w:t>
+            </w:r>
+            <w:proofErr w:type="spellEnd"/>
+            <w:r>
+              <w:rPr>
+                <w:rFonts w:ascii="Calibri" w:hAnsi="Calibri"/>
+                <w:color w:val="EE0000"/>
+              </w:rPr>
+              <w:t>)</w:t>
             </w:r>
           </w:p>
         </w:tc>
@@ -1477,7 +1503,21 @@
               <w:rPr>
                 <w:rFonts w:ascii="Calibri" w:hAnsi="Calibri"/>
               </w:rPr>
-              <w:t xml:space="preserve">Touchscreen display (HMI) for vehicle telemetry, including battery state of charge (SOC), system diagnostic codes, steering mode, and spreader status (twistlocks locked/unlocked, spreader </w:t>
+              <w:t>Touchscreen display (HMI) for vehicle telemetry, including battery state of charge (SOC), system diagnostic codes, steering mode, and spreader status (</w:t>
+            </w:r>
+            <w:proofErr w:type="spellStart"/>
+            <w:r>
+              <w:rPr>
+                <w:rFonts w:ascii="Calibri" w:hAnsi="Calibri"/>
+              </w:rPr>
+              <w:t>twistlocks</w:t>
+            </w:r>
+            <w:proofErr w:type="spellEnd"/>
+            <w:r>
+              <w:rPr>
+                <w:rFonts w:ascii="Calibri" w:hAnsi="Calibri"/>
+              </w:rPr>
+              <w:t xml:space="preserve"> locked/unlocked, spreader </w:t>
             </w:r>
             <w:r>
               <w:rPr>
@@ -1630,11 +1670,61 @@
                 <w:color w:val="FF0000"/>
               </w:rPr>
             </w:pPr>
-            <w:r>
-              <w:rPr>
-                <w:rFonts w:ascii="Calibri" w:hAnsi="Calibri"/>
-              </w:rPr>
-              <w:t>Twistlocks: Buttons on Right joystick head (Bit 0: Lock, Bit 1: Unlock). Telescoping: Buttons on Right joystick head (Bit 2: Retract, Bit 3: Extend). Sideshift: Left joystick X-axis (Sideshift AB) and Right joystick X-axis (Sideshift CD) for independent control and skew adjustment.</w:t>
+            <w:proofErr w:type="spellStart"/>
+            <w:r>
+              <w:rPr>
+                <w:rFonts w:ascii="Calibri" w:hAnsi="Calibri"/>
+              </w:rPr>
+              <w:t>Twistlocks</w:t>
+            </w:r>
+            <w:proofErr w:type="spellEnd"/>
+            <w:r>
+              <w:rPr>
+                <w:rFonts w:ascii="Calibri" w:hAnsi="Calibri"/>
+              </w:rPr>
+              <w:t xml:space="preserve">: Buttons on Right joystick head (Bit 0: Lock, Bit 1: Unlock). Telescoping: Buttons on Right joystick head (Bit 2: Retract, Bit 3: Extend). </w:t>
+            </w:r>
+            <w:proofErr w:type="spellStart"/>
+            <w:r>
+              <w:rPr>
+                <w:rFonts w:ascii="Calibri" w:hAnsi="Calibri"/>
+              </w:rPr>
+              <w:t>Sideshift</w:t>
+            </w:r>
+            <w:proofErr w:type="spellEnd"/>
+            <w:r>
+              <w:rPr>
+                <w:rFonts w:ascii="Calibri" w:hAnsi="Calibri"/>
+              </w:rPr>
+              <w:t>: Left joystick X-axis (</w:t>
+            </w:r>
+            <w:proofErr w:type="spellStart"/>
+            <w:r>
+              <w:rPr>
+                <w:rFonts w:ascii="Calibri" w:hAnsi="Calibri"/>
+              </w:rPr>
+              <w:t>Sideshift</w:t>
+            </w:r>
+            <w:proofErr w:type="spellEnd"/>
+            <w:r>
+              <w:rPr>
+                <w:rFonts w:ascii="Calibri" w:hAnsi="Calibri"/>
+              </w:rPr>
+              <w:t xml:space="preserve"> AB) and Right joystick X-axis (</w:t>
+            </w:r>
+            <w:proofErr w:type="spellStart"/>
+            <w:r>
+              <w:rPr>
+                <w:rFonts w:ascii="Calibri" w:hAnsi="Calibri"/>
+              </w:rPr>
+              <w:t>Sideshift</w:t>
+            </w:r>
+            <w:proofErr w:type="spellEnd"/>
+            <w:r>
+              <w:rPr>
+                <w:rFonts w:ascii="Calibri" w:hAnsi="Calibri"/>
+              </w:rPr>
+              <w:t xml:space="preserve"> CD) for independent control and skew adjustment.</w:t>
             </w:r>
           </w:p>
         </w:tc>

</xml_diff>

<commit_message>
feat: integrate winch speed and 80% SOC cycle predictions into spec docx and update handoff
</commit_message>
<xml_diff>
--- a/docs/Spec/Isoloader MJ35 Specifications-v2.docx
+++ b/docs/Spec/Isoloader MJ35 Specifications-v2.docx
@@ -393,11 +393,12 @@
                 <w:color w:val="00B0F0"/>
               </w:rPr>
             </w:pPr>
-            <w:r>
-              <w:rPr>
-                <w:color w:val="00B0F0"/>
-              </w:rPr>
-              <w:t>6 m/min</w:t>
+            <w:r/>
+            <w:r>
+              <w:rPr>
+                <w:rFonts w:ascii="Calibri" w:hAnsi="Calibri"/>
+              </w:rPr>
+              <w:t>6 m/min (Experimental 20T: 5.64 m/min Raise / 4.59 m/min Lower)</w:t>
             </w:r>
           </w:p>
         </w:tc>
@@ -1015,11 +1016,50 @@
             <w:tcW w:w="8005" w:type="dxa"/>
           </w:tcPr>
           <w:p>
-            <w:r>
-              <w:rPr>
-                <w:rFonts w:ascii="Calibri" w:hAnsi="Calibri"/>
-              </w:rPr>
-              <w:t>15-25% recovery (from regenerative braking and lowering spreader)</w:t>
+            <w:r/>
+            <w:r>
+              <w:rPr>
+                <w:rFonts w:ascii="Calibri" w:hAnsi="Calibri"/>
+              </w:rPr>
+              <w:t>15-25% recovery (Traction/Travel), up to 45-50% recovery (Winch/Lowering 20T load)</w:t>
+            </w:r>
+          </w:p>
+        </w:tc>
+      </w:tr>
+      <w:tr>
+        <w:tc>
+          <w:tcPr>
+            <w:tcW w:type="dxa" w:w="2785"/>
+          </w:tcPr>
+          <w:p>
+            <w:r/>
+            <w:r>
+              <w:rPr>
+                <w:rFonts w:ascii="Calibri" w:hAnsi="Calibri"/>
+              </w:rPr>
+              <w:t>Projected Winch Cycles (80% SOC)</w:t>
+            </w:r>
+          </w:p>
+        </w:tc>
+        <w:tc>
+          <w:tcPr>
+            <w:tcW w:type="dxa" w:w="8005"/>
+          </w:tcPr>
+          <w:p>
+            <w:r/>
+            <w:r>
+              <w:rPr>
+                <w:rFonts w:ascii="Calibri" w:hAnsi="Calibri"/>
+              </w:rPr>
+              <w:t>Dự báo số chu kỳ nâng hạ với 80% dung lượng pin (91.62 kWh khả dụng)</w:t>
+              <w:br/>
+              <w:t>Trường hợp KHÔNG tính năng lượng thu hồi (Giới hạn tiêu hao thô):</w:t>
+              <w:br/>
+              <w:t>Xe thực hiện được 280 chu kỳ nâng và hạ liên tục.</w:t>
+              <w:br/>
+              <w:t>Trường hợp CÓ tính năng lượng thu hồi (Tiêu hao thuần thực tế):</w:t>
+              <w:br/>
+              <w:t>Xe thực hiện được 536 chu kỳ nâng và hạ liên tục. (Số chu kỳ thực tế sẽ dao động từ 280 đến 536 lượt tùy thuộc vào hiệu suất nạp/xả của pin và mức độ hao phí nhiệt lượng).</w:t>
             </w:r>
           </w:p>
         </w:tc>

</xml_diff>

<commit_message>
feat: translate winch cycles specification to English and update handoff
</commit_message>
<xml_diff>
--- a/docs/Spec/Isoloader MJ35 Specifications-v2.docx
+++ b/docs/Spec/Isoloader MJ35 Specifications-v2.docx
@@ -1051,15 +1051,15 @@
               <w:rPr>
                 <w:rFonts w:ascii="Calibri" w:hAnsi="Calibri"/>
               </w:rPr>
-              <w:t>Dự báo số chu kỳ nâng hạ với 80% dung lượng pin (91.62 kWh khả dụng)</w:t>
+              <w:t>Projected raise/lower cycles using 80% of battery capacity (91.62 kWh usable)</w:t>
               <w:br/>
-              <w:t>Trường hợp KHÔNG tính năng lượng thu hồi (Giới hạn tiêu hao thô):</w:t>
+              <w:t>• Without regenerative energy recovery (Gross consumption limit):</w:t>
               <w:br/>
-              <w:t>Xe thực hiện được 280 chu kỳ nâng và hạ liên tục.</w:t>
+              <w:t>The crane can perform 280 continuous raise and lower cycles.</w:t>
               <w:br/>
-              <w:t>Trường hợp CÓ tính năng lượng thu hồi (Tiêu hao thuần thực tế):</w:t>
+              <w:t>• With regenerative energy recovery (Actual net consumption):</w:t>
               <w:br/>
-              <w:t>Xe thực hiện được 536 chu kỳ nâng và hạ liên tục. (Số chu kỳ thực tế sẽ dao động từ 280 đến 536 lượt tùy thuộc vào hiệu suất nạp/xả của pin và mức độ hao phí nhiệt lượng).</w:t>
+              <w:t>The crane can perform 536 continuous raise and lower cycles. (The actual number of cycles will range from 280 to 536 depending on battery charging/discharging efficiency and thermal losses).</w:t>
             </w:r>
           </w:p>
         </w:tc>

</xml_diff>

<commit_message>
feat: add steering modes and hourly runtime conversions to energy specifications
</commit_message>
<xml_diff>
--- a/docs/Spec/Isoloader MJ35 Specifications-v2.docx
+++ b/docs/Spec/Isoloader MJ35 Specifications-v2.docx
@@ -529,6 +529,38 @@
             <w:tcW w:w="2785" w:type="dxa"/>
           </w:tcPr>
           <w:p>
+            <w:r/>
+            <w:r>
+              <w:rPr>
+                <w:rFonts w:ascii="Calibri" w:hAnsi="Calibri"/>
+                <w:b/>
+              </w:rPr>
+              <w:t>Steering Modes</w:t>
+            </w:r>
+          </w:p>
+        </w:tc>
+        <w:tc>
+          <w:tcPr>
+            <w:tcW w:w="8005" w:type="dxa"/>
+          </w:tcPr>
+          <w:p>
+            <w:r/>
+            <w:r>
+              <w:rPr>
+                <w:rFonts w:ascii="Calibri" w:hAnsi="Calibri"/>
+                <w:b w:val="0"/>
+              </w:rPr>
+              <w:t>4WS (4-Wheel Steer), Lateral (90° travel), Carousel (pivot turn)</w:t>
+            </w:r>
+          </w:p>
+        </w:tc>
+      </w:tr>
+      <w:tr>
+        <w:tc>
+          <w:tcPr>
+            <w:tcW w:w="2785" w:type="dxa"/>
+          </w:tcPr>
+          <w:p>
             <w:pPr>
               <w:rPr>
                 <w:noProof/>
@@ -983,11 +1015,13 @@
                 <w:bCs/>
               </w:rPr>
             </w:pPr>
-            <w:r>
-              <w:rPr>
-                <w:rFonts w:ascii="Calibri" w:hAnsi="Calibri"/>
-              </w:rPr>
-              <w:t>Traction: ~1.5 kWh/km (unladen) to ~3.5 kWh/km (laden); Hoist: ~0.15 kWh/cycle (20T lift/lower); Standby: ~3.7 kWh/h (with HVAC ON)</w:t>
+            <w:r/>
+            <w:r>
+              <w:rPr>
+                <w:rFonts w:ascii="Calibri" w:hAnsi="Calibri"/>
+                <w:b w:val="0"/>
+              </w:rPr>
+              <w:t>Traction: ~1.5 kWh/km unladen (approx. 12.0 kWh/h or 7.6 hours continuous travel at 8 km/h on 80% SOC) to ~3.5 kWh/km laden (approx. 17.5 kWh/h or 5.2 hours continuous travel at 5 km/h on 80% SOC); Hoist: ~0.15 kWh/cycle net for 20T lift/lower (approx. 0.09 kWh/min or 14.8 hours continuous hoisting on 80% SOC); Standby: ~3.7 kWh/h with HVAC ON (approx. 24.8 hours continuous standby on 80% SOC)</w:t>
             </w:r>
           </w:p>
         </w:tc>

</xml_diff>

<commit_message>
docs: update Battery Consumption Calculation Report to v2.0 with final telemetry data
</commit_message>
<xml_diff>
--- a/docs/Spec/Isoloader MJ35 Specifications-v2.docx
+++ b/docs/Spec/Isoloader MJ35 Specifications-v2.docx
@@ -76,17 +76,20 @@
           <w:p>
             <w:pPr>
               <w:rPr>
-                <w:color w:val="FF0000"/>
-              </w:rPr>
-            </w:pPr>
-            <w:r>
-              <w:rPr>
+                <w:rFonts w:asciiTheme="majorHAnsi" w:hAnsiTheme="majorHAnsi"/>
+                <w:color w:val="FF0000"/>
+              </w:rPr>
+            </w:pPr>
+            <w:r>
+              <w:rPr>
+                <w:rFonts w:asciiTheme="majorHAnsi" w:hAnsiTheme="majorHAnsi"/>
                 <w:noProof/>
               </w:rPr>
               <w:t>ISO-35</w:t>
             </w:r>
             <w:r>
               <w:rPr>
+                <w:rFonts w:asciiTheme="majorHAnsi" w:hAnsiTheme="majorHAnsi"/>
                 <w:noProof/>
               </w:rPr>
               <w:tab/>
@@ -100,11 +103,13 @@
           <w:p>
             <w:pPr>
               <w:rPr>
-                <w:color w:val="FF0000"/>
-              </w:rPr>
-            </w:pPr>
-            <w:r>
-              <w:rPr>
+                <w:rFonts w:asciiTheme="majorHAnsi" w:hAnsiTheme="majorHAnsi"/>
+                <w:color w:val="FF0000"/>
+              </w:rPr>
+            </w:pPr>
+            <w:r>
+              <w:rPr>
+                <w:rFonts w:asciiTheme="majorHAnsi" w:hAnsiTheme="majorHAnsi"/>
                 <w:noProof/>
               </w:rPr>
               <w:t>Lift 1x9’6” over 1x9’6” containers</w:t>
@@ -120,11 +125,13 @@
           <w:p>
             <w:pPr>
               <w:rPr>
-                <w:color w:val="FF0000"/>
-              </w:rPr>
-            </w:pPr>
-            <w:r>
-              <w:rPr>
+                <w:rFonts w:asciiTheme="majorHAnsi" w:hAnsiTheme="majorHAnsi"/>
+                <w:color w:val="FF0000"/>
+              </w:rPr>
+            </w:pPr>
+            <w:r>
+              <w:rPr>
+                <w:rFonts w:asciiTheme="majorHAnsi" w:hAnsiTheme="majorHAnsi"/>
                 <w:noProof/>
               </w:rPr>
               <w:t>ISO-35-3H</w:t>
@@ -138,11 +145,13 @@
           <w:p>
             <w:pPr>
               <w:rPr>
-                <w:color w:val="FF0000"/>
-              </w:rPr>
-            </w:pPr>
-            <w:r>
-              <w:rPr>
+                <w:rFonts w:asciiTheme="majorHAnsi" w:hAnsiTheme="majorHAnsi"/>
+                <w:color w:val="FF0000"/>
+              </w:rPr>
+            </w:pPr>
+            <w:r>
+              <w:rPr>
+                <w:rFonts w:asciiTheme="majorHAnsi" w:hAnsiTheme="majorHAnsi"/>
                 <w:noProof/>
               </w:rPr>
               <w:t>Lift 1x9’6” over 2x9’6” containers</w:t>
@@ -207,368 +216,438 @@
             <w:tcW w:w="2785" w:type="dxa"/>
           </w:tcPr>
           <w:p>
-            <w:r>
-              <w:t>Travel Speed</w:t>
-            </w:r>
-            <w:r>
-              <w:t xml:space="preserve"> Unload</w:t>
-            </w:r>
-          </w:p>
-        </w:tc>
-        <w:tc>
-          <w:tcPr>
-            <w:tcW w:w="8005" w:type="dxa"/>
-          </w:tcPr>
-          <w:p>
-            <w:pPr>
-              <w:rPr>
-                <w:color w:val="FF0000"/>
-              </w:rPr>
-            </w:pPr>
-            <w:r>
-              <w:rPr>
+            <w:pPr>
+              <w:rPr>
+                <w:rFonts w:asciiTheme="majorHAnsi" w:hAnsiTheme="majorHAnsi"/>
+              </w:rPr>
+            </w:pPr>
+            <w:r>
+              <w:rPr>
+                <w:rFonts w:asciiTheme="majorHAnsi" w:hAnsiTheme="majorHAnsi"/>
+              </w:rPr>
+              <w:t xml:space="preserve">Travel Speed </w:t>
+            </w:r>
+            <w:r>
+              <w:rPr>
+                <w:rFonts w:asciiTheme="majorHAnsi" w:hAnsiTheme="majorHAnsi"/>
+              </w:rPr>
+              <w:t>Unladen</w:t>
+            </w:r>
+          </w:p>
+        </w:tc>
+        <w:tc>
+          <w:tcPr>
+            <w:tcW w:w="8005" w:type="dxa"/>
+          </w:tcPr>
+          <w:p>
+            <w:pPr>
+              <w:rPr>
+                <w:rFonts w:asciiTheme="majorHAnsi" w:hAnsiTheme="majorHAnsi"/>
+              </w:rPr>
+            </w:pPr>
+            <w:r>
+              <w:rPr>
+                <w:rFonts w:asciiTheme="majorHAnsi" w:hAnsiTheme="majorHAnsi"/>
+              </w:rPr>
+              <w:t>Variable to 8km/h</w:t>
+            </w:r>
+          </w:p>
+        </w:tc>
+      </w:tr>
+      <w:tr>
+        <w:tc>
+          <w:tcPr>
+            <w:tcW w:w="2785" w:type="dxa"/>
+          </w:tcPr>
+          <w:p>
+            <w:pPr>
+              <w:rPr>
+                <w:rFonts w:asciiTheme="majorHAnsi" w:hAnsiTheme="majorHAnsi"/>
+                <w:lang w:val="vi-VN"/>
+              </w:rPr>
+            </w:pPr>
+            <w:r>
+              <w:rPr>
+                <w:rFonts w:asciiTheme="majorHAnsi" w:hAnsiTheme="majorHAnsi"/>
+              </w:rPr>
+              <w:t xml:space="preserve">Travel Speed </w:t>
+            </w:r>
+            <w:r>
+              <w:rPr>
+                <w:rFonts w:asciiTheme="majorHAnsi" w:hAnsiTheme="majorHAnsi"/>
+              </w:rPr>
+              <w:t>Laden</w:t>
+            </w:r>
+          </w:p>
+        </w:tc>
+        <w:tc>
+          <w:tcPr>
+            <w:tcW w:w="8005" w:type="dxa"/>
+          </w:tcPr>
+          <w:p>
+            <w:pPr>
+              <w:rPr>
+                <w:rFonts w:asciiTheme="majorHAnsi" w:hAnsiTheme="majorHAnsi"/>
+              </w:rPr>
+            </w:pPr>
+            <w:r>
+              <w:rPr>
+                <w:rFonts w:asciiTheme="majorHAnsi" w:hAnsiTheme="majorHAnsi"/>
+              </w:rPr>
+              <w:t xml:space="preserve">Variable to </w:t>
+            </w:r>
+            <w:r>
+              <w:rPr>
+                <w:rFonts w:asciiTheme="majorHAnsi" w:hAnsiTheme="majorHAnsi"/>
+              </w:rPr>
+              <w:t>5</w:t>
+            </w:r>
+            <w:r>
+              <w:rPr>
+                <w:rFonts w:asciiTheme="majorHAnsi" w:hAnsiTheme="majorHAnsi"/>
+              </w:rPr>
+              <w:t>km/h</w:t>
+            </w:r>
+          </w:p>
+        </w:tc>
+      </w:tr>
+      <w:tr>
+        <w:tc>
+          <w:tcPr>
+            <w:tcW w:w="2785" w:type="dxa"/>
+          </w:tcPr>
+          <w:p>
+            <w:pPr>
+              <w:rPr>
+                <w:rFonts w:asciiTheme="majorHAnsi" w:hAnsiTheme="majorHAnsi"/>
+              </w:rPr>
+            </w:pPr>
+            <w:r>
+              <w:rPr>
+                <w:rFonts w:asciiTheme="majorHAnsi" w:hAnsiTheme="majorHAnsi"/>
+              </w:rPr>
+              <w:t>Lifting Capacity</w:t>
+            </w:r>
+          </w:p>
+        </w:tc>
+        <w:tc>
+          <w:tcPr>
+            <w:tcW w:w="8005" w:type="dxa"/>
+          </w:tcPr>
+          <w:p>
+            <w:pPr>
+              <w:rPr>
+                <w:rFonts w:asciiTheme="majorHAnsi" w:hAnsiTheme="majorHAnsi"/>
+              </w:rPr>
+            </w:pPr>
+            <w:r>
+              <w:rPr>
+                <w:rFonts w:asciiTheme="majorHAnsi" w:hAnsiTheme="majorHAnsi"/>
+              </w:rPr>
+              <w:t>35 T</w:t>
+            </w:r>
+          </w:p>
+        </w:tc>
+      </w:tr>
+      <w:tr>
+        <w:tc>
+          <w:tcPr>
+            <w:tcW w:w="2785" w:type="dxa"/>
+          </w:tcPr>
+          <w:p>
+            <w:pPr>
+              <w:rPr>
+                <w:rFonts w:asciiTheme="majorHAnsi" w:hAnsiTheme="majorHAnsi"/>
+                <w:noProof/>
+              </w:rPr>
+            </w:pPr>
+            <w:r>
+              <w:rPr>
+                <w:rFonts w:asciiTheme="majorHAnsi" w:hAnsiTheme="majorHAnsi"/>
+              </w:rPr>
+              <w:t>Lifting Speed</w:t>
+            </w:r>
+            <w:r>
+              <w:rPr>
+                <w:rFonts w:asciiTheme="majorHAnsi" w:hAnsiTheme="majorHAnsi"/>
+              </w:rPr>
+              <w:t xml:space="preserve"> </w:t>
+            </w:r>
+            <w:r>
+              <w:rPr>
+                <w:rFonts w:asciiTheme="majorHAnsi" w:hAnsiTheme="majorHAnsi"/>
+              </w:rPr>
+              <w:t>Unladen</w:t>
+            </w:r>
+          </w:p>
+        </w:tc>
+        <w:tc>
+          <w:tcPr>
+            <w:tcW w:w="8005" w:type="dxa"/>
+          </w:tcPr>
+          <w:p>
+            <w:pPr>
+              <w:rPr>
+                <w:rFonts w:asciiTheme="majorHAnsi" w:hAnsiTheme="majorHAnsi"/>
+                <w:noProof/>
+              </w:rPr>
+            </w:pPr>
+            <w:r>
+              <w:rPr>
+                <w:rFonts w:asciiTheme="majorHAnsi" w:hAnsiTheme="majorHAnsi"/>
+              </w:rPr>
+              <w:t>10</w:t>
+            </w:r>
+            <w:r>
+              <w:rPr>
+                <w:rFonts w:asciiTheme="majorHAnsi" w:hAnsiTheme="majorHAnsi"/>
+              </w:rPr>
+              <w:t xml:space="preserve"> m/min</w:t>
+            </w:r>
+          </w:p>
+        </w:tc>
+      </w:tr>
+      <w:tr>
+        <w:tc>
+          <w:tcPr>
+            <w:tcW w:w="2785" w:type="dxa"/>
+          </w:tcPr>
+          <w:p>
+            <w:pPr>
+              <w:rPr>
+                <w:rFonts w:asciiTheme="majorHAnsi" w:hAnsiTheme="majorHAnsi"/>
+                <w:lang w:val="vi-VN"/>
+              </w:rPr>
+            </w:pPr>
+            <w:r>
+              <w:rPr>
+                <w:rFonts w:asciiTheme="majorHAnsi" w:hAnsiTheme="majorHAnsi"/>
+              </w:rPr>
+              <w:t xml:space="preserve">Lifting Speed </w:t>
+            </w:r>
+            <w:r>
+              <w:rPr>
+                <w:rFonts w:asciiTheme="majorHAnsi" w:hAnsiTheme="majorHAnsi"/>
+              </w:rPr>
+              <w:t>Laden</w:t>
+            </w:r>
+          </w:p>
+        </w:tc>
+        <w:tc>
+          <w:tcPr>
+            <w:tcW w:w="8005" w:type="dxa"/>
+          </w:tcPr>
+          <w:p>
+            <w:pPr>
+              <w:rPr>
+                <w:rFonts w:asciiTheme="majorHAnsi" w:hAnsiTheme="majorHAnsi"/>
                 <w:color w:val="00B0F0"/>
-              </w:rPr>
-              <w:t xml:space="preserve">Variable to </w:t>
-            </w:r>
-            <w:r>
-              <w:rPr>
-                <w:color w:val="00B0F0"/>
-              </w:rPr>
-              <w:t>8</w:t>
-            </w:r>
-            <w:r>
-              <w:rPr>
-                <w:color w:val="00B0F0"/>
-              </w:rPr>
-              <w:t>km/h</w:t>
-            </w:r>
-          </w:p>
-        </w:tc>
-      </w:tr>
-      <w:tr>
-        <w:tc>
-          <w:tcPr>
-            <w:tcW w:w="2785" w:type="dxa"/>
-          </w:tcPr>
-          <w:p>
-            <w:r>
-              <w:t>Travel Speed Load</w:t>
-            </w:r>
-          </w:p>
-        </w:tc>
-        <w:tc>
-          <w:tcPr>
-            <w:tcW w:w="8005" w:type="dxa"/>
-          </w:tcPr>
-          <w:p>
-            <w:pPr>
-              <w:rPr>
-                <w:color w:val="00B0F0"/>
-              </w:rPr>
-            </w:pPr>
-            <w:r>
-              <w:rPr>
-                <w:color w:val="00B0F0"/>
-              </w:rPr>
-              <w:t xml:space="preserve">Variable to </w:t>
-            </w:r>
-            <w:r>
-              <w:rPr>
-                <w:color w:val="00B0F0"/>
-              </w:rPr>
-              <w:t>5</w:t>
-            </w:r>
-            <w:r>
-              <w:rPr>
-                <w:color w:val="00B0F0"/>
-              </w:rPr>
-              <w:t>km/h</w:t>
-            </w:r>
-          </w:p>
-        </w:tc>
-      </w:tr>
-      <w:tr>
-        <w:tc>
-          <w:tcPr>
-            <w:tcW w:w="2785" w:type="dxa"/>
-          </w:tcPr>
-          <w:p>
-            <w:pPr>
-              <w:rPr>
-                <w:color w:val="FF0000"/>
-              </w:rPr>
-            </w:pPr>
-            <w:r>
-              <w:t>Lifting Capacity</w:t>
-            </w:r>
-          </w:p>
-        </w:tc>
-        <w:tc>
-          <w:tcPr>
-            <w:tcW w:w="8005" w:type="dxa"/>
-          </w:tcPr>
-          <w:p>
-            <w:pPr>
-              <w:rPr>
-                <w:color w:val="FF0000"/>
-              </w:rPr>
-            </w:pPr>
-            <w:r>
-              <w:t>35 T</w:t>
-            </w:r>
-          </w:p>
-        </w:tc>
-      </w:tr>
-      <w:tr>
-        <w:tc>
-          <w:tcPr>
-            <w:tcW w:w="2785" w:type="dxa"/>
-          </w:tcPr>
-          <w:p>
-            <w:pPr>
-              <w:rPr>
+                <w:lang w:val="vi-VN"/>
+              </w:rPr>
+            </w:pPr>
+            <w:r>
+              <w:rPr>
+                <w:rFonts w:asciiTheme="majorHAnsi" w:hAnsiTheme="majorHAnsi"/>
+              </w:rPr>
+              <w:t>6 m/min</w:t>
+            </w:r>
+          </w:p>
+        </w:tc>
+      </w:tr>
+      <w:tr>
+        <w:tc>
+          <w:tcPr>
+            <w:tcW w:w="2785" w:type="dxa"/>
+          </w:tcPr>
+          <w:p>
+            <w:pPr>
+              <w:rPr>
+                <w:rFonts w:asciiTheme="majorHAnsi" w:hAnsiTheme="majorHAnsi"/>
                 <w:noProof/>
                 <w:color w:val="FF0000"/>
               </w:rPr>
             </w:pPr>
             <w:r>
-              <w:t>Lifting Speed</w:t>
-            </w:r>
-            <w:r>
-              <w:t xml:space="preserve"> </w:t>
-            </w:r>
-            <w:r>
-              <w:t>Unl</w:t>
-            </w:r>
-            <w:r>
-              <w:t>oad</w:t>
-            </w:r>
-          </w:p>
-        </w:tc>
-        <w:tc>
-          <w:tcPr>
-            <w:tcW w:w="8005" w:type="dxa"/>
-          </w:tcPr>
-          <w:p>
-            <w:pPr>
-              <w:rPr>
+              <w:rPr>
+                <w:rFonts w:asciiTheme="majorHAnsi" w:hAnsiTheme="majorHAnsi"/>
+              </w:rPr>
+              <w:t>Lifting System</w:t>
+            </w:r>
+          </w:p>
+        </w:tc>
+        <w:tc>
+          <w:tcPr>
+            <w:tcW w:w="8005" w:type="dxa"/>
+          </w:tcPr>
+          <w:p>
+            <w:pPr>
+              <w:rPr>
+                <w:rFonts w:asciiTheme="majorHAnsi" w:hAnsiTheme="majorHAnsi"/>
                 <w:noProof/>
                 <w:color w:val="FF0000"/>
               </w:rPr>
             </w:pPr>
             <w:r>
               <w:rPr>
-                <w:color w:val="00B0F0"/>
-              </w:rPr>
-              <w:t>10</w:t>
-            </w:r>
-            <w:r>
-              <w:rPr>
-                <w:color w:val="00B0F0"/>
-              </w:rPr>
-              <w:t xml:space="preserve"> m/min</w:t>
-            </w:r>
-          </w:p>
-        </w:tc>
-      </w:tr>
-      <w:tr>
-        <w:tc>
-          <w:tcPr>
-            <w:tcW w:w="2785" w:type="dxa"/>
-          </w:tcPr>
-          <w:p>
-            <w:r>
-              <w:t>Lifting Speed Load</w:t>
-            </w:r>
-          </w:p>
-        </w:tc>
-        <w:tc>
-          <w:tcPr>
-            <w:tcW w:w="8005" w:type="dxa"/>
-          </w:tcPr>
-          <w:p>
-            <w:pPr>
-              <w:rPr>
-                <w:color w:val="00B0F0"/>
-              </w:rPr>
-            </w:pPr>
-            <w:r/>
-            <w:r>
-              <w:rPr>
-                <w:rFonts w:ascii="Calibri" w:hAnsi="Calibri"/>
-              </w:rPr>
-              <w:t>6 m/min (Experimental 20T Max: 7.14 m/min Raise / 6.38 m/min Lower; Avg: 5.64 m/min Raise / 4.59 m/min Lower)</w:t>
-            </w:r>
-          </w:p>
-        </w:tc>
-      </w:tr>
-      <w:tr>
-        <w:tc>
-          <w:tcPr>
-            <w:tcW w:w="2785" w:type="dxa"/>
-          </w:tcPr>
-          <w:p>
-            <w:pPr>
-              <w:rPr>
+                <w:rFonts w:asciiTheme="majorHAnsi" w:hAnsiTheme="majorHAnsi"/>
+              </w:rPr>
+              <w:t>4x Electric Motors with integrated electric brakes</w:t>
+            </w:r>
+          </w:p>
+        </w:tc>
+      </w:tr>
+      <w:tr>
+        <w:tc>
+          <w:tcPr>
+            <w:tcW w:w="2785" w:type="dxa"/>
+          </w:tcPr>
+          <w:p>
+            <w:pPr>
+              <w:rPr>
+                <w:rFonts w:asciiTheme="majorHAnsi" w:hAnsiTheme="majorHAnsi"/>
                 <w:noProof/>
                 <w:color w:val="FF0000"/>
               </w:rPr>
             </w:pPr>
             <w:r>
-              <w:t>Lifting System</w:t>
-            </w:r>
-          </w:p>
-        </w:tc>
-        <w:tc>
-          <w:tcPr>
-            <w:tcW w:w="8005" w:type="dxa"/>
-          </w:tcPr>
-          <w:p>
-            <w:pPr>
-              <w:rPr>
+              <w:rPr>
+                <w:rFonts w:asciiTheme="majorHAnsi" w:hAnsiTheme="majorHAnsi"/>
+              </w:rPr>
+              <w:t>Wheels</w:t>
+            </w:r>
+          </w:p>
+        </w:tc>
+        <w:tc>
+          <w:tcPr>
+            <w:tcW w:w="8005" w:type="dxa"/>
+          </w:tcPr>
+          <w:p>
+            <w:pPr>
+              <w:rPr>
+                <w:rFonts w:asciiTheme="majorHAnsi" w:hAnsiTheme="majorHAnsi"/>
                 <w:noProof/>
                 <w:color w:val="FF0000"/>
               </w:rPr>
             </w:pPr>
             <w:r>
               <w:rPr>
-                <w:rFonts w:ascii="Calibri" w:hAnsi="Calibri"/>
-              </w:rPr>
-              <w:t>4x Electric Motors with integrated electric brakes</w:t>
-            </w:r>
-          </w:p>
-        </w:tc>
-      </w:tr>
-      <w:tr>
-        <w:tc>
-          <w:tcPr>
-            <w:tcW w:w="2785" w:type="dxa"/>
-          </w:tcPr>
-          <w:p>
-            <w:pPr>
-              <w:rPr>
+                <w:rFonts w:asciiTheme="majorHAnsi" w:hAnsiTheme="majorHAnsi"/>
+              </w:rPr>
+              <w:t>4</w:t>
+            </w:r>
+          </w:p>
+        </w:tc>
+      </w:tr>
+      <w:tr>
+        <w:tc>
+          <w:tcPr>
+            <w:tcW w:w="2785" w:type="dxa"/>
+          </w:tcPr>
+          <w:p>
+            <w:pPr>
+              <w:rPr>
+                <w:rFonts w:asciiTheme="majorHAnsi" w:hAnsiTheme="majorHAnsi"/>
                 <w:noProof/>
                 <w:color w:val="FF0000"/>
               </w:rPr>
             </w:pPr>
             <w:r>
-              <w:t>Wheels</w:t>
-            </w:r>
-          </w:p>
-        </w:tc>
-        <w:tc>
-          <w:tcPr>
-            <w:tcW w:w="8005" w:type="dxa"/>
-          </w:tcPr>
-          <w:p>
-            <w:pPr>
-              <w:rPr>
+              <w:rPr>
+                <w:rFonts w:asciiTheme="majorHAnsi" w:hAnsiTheme="majorHAnsi"/>
+              </w:rPr>
+              <w:t>Steer Wheels</w:t>
+            </w:r>
+          </w:p>
+        </w:tc>
+        <w:tc>
+          <w:tcPr>
+            <w:tcW w:w="8005" w:type="dxa"/>
+          </w:tcPr>
+          <w:p>
+            <w:pPr>
+              <w:rPr>
+                <w:rFonts w:asciiTheme="majorHAnsi" w:hAnsiTheme="majorHAnsi"/>
                 <w:noProof/>
                 <w:color w:val="FF0000"/>
               </w:rPr>
             </w:pPr>
             <w:r>
-              <w:t>4</w:t>
-            </w:r>
-          </w:p>
-        </w:tc>
-      </w:tr>
-      <w:tr>
-        <w:tc>
-          <w:tcPr>
-            <w:tcW w:w="2785" w:type="dxa"/>
-          </w:tcPr>
-          <w:p>
-            <w:pPr>
-              <w:rPr>
+              <w:rPr>
+                <w:rFonts w:asciiTheme="majorHAnsi" w:hAnsiTheme="majorHAnsi"/>
+              </w:rPr>
+              <w:t>4 Wheel steer driven by 4 electric motors, ±45° (up to ±</w:t>
+            </w:r>
+            <w:r>
+              <w:rPr>
+                <w:rFonts w:asciiTheme="majorHAnsi" w:hAnsiTheme="majorHAnsi"/>
+              </w:rPr>
+              <w:t>90</w:t>
+            </w:r>
+            <w:r>
+              <w:rPr>
+                <w:rFonts w:asciiTheme="majorHAnsi" w:hAnsiTheme="majorHAnsi"/>
+              </w:rPr>
+              <w:t>° in lateral mode)</w:t>
+            </w:r>
+          </w:p>
+        </w:tc>
+      </w:tr>
+      <w:tr>
+        <w:tc>
+          <w:tcPr>
+            <w:tcW w:w="2785" w:type="dxa"/>
+          </w:tcPr>
+          <w:p>
+            <w:pPr>
+              <w:rPr>
+                <w:rFonts w:asciiTheme="majorHAnsi" w:hAnsiTheme="majorHAnsi"/>
+              </w:rPr>
+            </w:pPr>
+            <w:r>
+              <w:rPr>
+                <w:rFonts w:asciiTheme="majorHAnsi" w:hAnsiTheme="majorHAnsi"/>
+                <w:b/>
+              </w:rPr>
+              <w:t>Steering Modes</w:t>
+            </w:r>
+          </w:p>
+        </w:tc>
+        <w:tc>
+          <w:tcPr>
+            <w:tcW w:w="8005" w:type="dxa"/>
+          </w:tcPr>
+          <w:p>
+            <w:pPr>
+              <w:rPr>
+                <w:rFonts w:asciiTheme="majorHAnsi" w:hAnsiTheme="majorHAnsi"/>
+                <w:lang w:val="vi-VN"/>
+              </w:rPr>
+            </w:pPr>
+            <w:r>
+              <w:rPr>
+                <w:rFonts w:asciiTheme="majorHAnsi" w:hAnsiTheme="majorHAnsi"/>
+              </w:rPr>
+              <w:t>4WS (4-Wheel Steer), Lateral, Carousel</w:t>
+            </w:r>
+          </w:p>
+        </w:tc>
+      </w:tr>
+      <w:tr>
+        <w:tc>
+          <w:tcPr>
+            <w:tcW w:w="2785" w:type="dxa"/>
+          </w:tcPr>
+          <w:p>
+            <w:pPr>
+              <w:rPr>
+                <w:rFonts w:asciiTheme="majorHAnsi" w:hAnsiTheme="majorHAnsi"/>
                 <w:noProof/>
                 <w:color w:val="FF0000"/>
               </w:rPr>
             </w:pPr>
             <w:r>
-              <w:t>Steer Wheels</w:t>
-            </w:r>
-          </w:p>
-        </w:tc>
-        <w:tc>
-          <w:tcPr>
-            <w:tcW w:w="8005" w:type="dxa"/>
-          </w:tcPr>
-          <w:p>
-            <w:pPr>
-              <w:rPr>
-                <w:noProof/>
-                <w:color w:val="FF0000"/>
-              </w:rPr>
-            </w:pPr>
-            <w:r>
-              <w:rPr>
-                <w:rFonts w:ascii="Calibri" w:hAnsi="Calibri"/>
-              </w:rPr>
-              <w:t>4 Wheel steer driven by 4 electric motors, ±45° (up to ±</w:t>
-            </w:r>
-            <w:r>
-              <w:rPr>
-                <w:rFonts w:ascii="Calibri" w:hAnsi="Calibri"/>
-              </w:rPr>
-              <w:t>90</w:t>
-            </w:r>
-            <w:r>
-              <w:rPr>
-                <w:rFonts w:ascii="Calibri" w:hAnsi="Calibri"/>
-              </w:rPr>
-              <w:t>° in lateral mode)</w:t>
-            </w:r>
-          </w:p>
-        </w:tc>
-      </w:tr>
-      <w:tr>
-        <w:tc>
-          <w:tcPr>
-            <w:tcW w:w="2785" w:type="dxa"/>
-          </w:tcPr>
-          <w:p>
-            <w:r/>
-            <w:r>
-              <w:rPr>
-                <w:rFonts w:ascii="Calibri" w:hAnsi="Calibri"/>
-                <w:b/>
-              </w:rPr>
-              <w:t>Steering Modes</w:t>
-            </w:r>
-          </w:p>
-        </w:tc>
-        <w:tc>
-          <w:tcPr>
-            <w:tcW w:w="8005" w:type="dxa"/>
-          </w:tcPr>
-          <w:p>
-            <w:r/>
-            <w:r>
-              <w:rPr>
-                <w:rFonts w:ascii="Calibri" w:hAnsi="Calibri"/>
-                <w:b w:val="0"/>
-              </w:rPr>
-              <w:t>4WS (4-Wheel Steer), Lateral (90° travel), Carousel (pivot turn)</w:t>
-            </w:r>
-          </w:p>
-        </w:tc>
-      </w:tr>
-      <w:tr>
-        <w:tc>
-          <w:tcPr>
-            <w:tcW w:w="2785" w:type="dxa"/>
-          </w:tcPr>
-          <w:p>
-            <w:pPr>
-              <w:rPr>
-                <w:noProof/>
-                <w:color w:val="FF0000"/>
-              </w:rPr>
-            </w:pPr>
-            <w:r>
-              <w:rPr>
+              <w:rPr>
+                <w:rFonts w:asciiTheme="majorHAnsi" w:hAnsiTheme="majorHAnsi"/>
                 <w:b/>
                 <w:bCs/>
               </w:rPr>
@@ -583,13 +662,14 @@
           <w:p>
             <w:pPr>
               <w:rPr>
+                <w:rFonts w:asciiTheme="majorHAnsi" w:hAnsiTheme="majorHAnsi"/>
                 <w:noProof/>
                 <w:color w:val="FF0000"/>
               </w:rPr>
             </w:pPr>
             <w:r>
               <w:rPr>
-                <w:rFonts w:ascii="Calibri" w:hAnsi="Calibri"/>
+                <w:rFonts w:asciiTheme="majorHAnsi" w:hAnsiTheme="majorHAnsi"/>
               </w:rPr>
               <w:t>10m (to outside wheel)</w:t>
             </w:r>
@@ -604,11 +684,15 @@
           <w:p>
             <w:pPr>
               <w:rPr>
+                <w:rFonts w:asciiTheme="majorHAnsi" w:hAnsiTheme="majorHAnsi"/>
                 <w:noProof/>
                 <w:color w:val="FF0000"/>
               </w:rPr>
             </w:pPr>
             <w:r>
+              <w:rPr>
+                <w:rFonts w:asciiTheme="majorHAnsi" w:hAnsiTheme="majorHAnsi"/>
+              </w:rPr>
               <w:t>Drive Wheels</w:t>
             </w:r>
           </w:p>
@@ -620,11 +704,15 @@
           <w:p>
             <w:pPr>
               <w:rPr>
+                <w:rFonts w:asciiTheme="majorHAnsi" w:hAnsiTheme="majorHAnsi"/>
                 <w:noProof/>
                 <w:color w:val="FF0000"/>
               </w:rPr>
             </w:pPr>
             <w:r>
+              <w:rPr>
+                <w:rFonts w:asciiTheme="majorHAnsi" w:hAnsiTheme="majorHAnsi"/>
+              </w:rPr>
               <w:t>4 Wheel drive</w:t>
             </w:r>
           </w:p>
@@ -636,7 +724,15 @@
             <w:tcW w:w="2785" w:type="dxa"/>
           </w:tcPr>
           <w:p>
-            <w:r>
+            <w:pPr>
+              <w:rPr>
+                <w:rFonts w:asciiTheme="majorHAnsi" w:hAnsiTheme="majorHAnsi"/>
+              </w:rPr>
+            </w:pPr>
+            <w:r>
+              <w:rPr>
+                <w:rFonts w:asciiTheme="majorHAnsi" w:hAnsiTheme="majorHAnsi"/>
+              </w:rPr>
               <w:t>Grade</w:t>
             </w:r>
           </w:p>
@@ -648,13 +744,14 @@
           <w:p>
             <w:pPr>
               <w:rPr>
+                <w:rFonts w:asciiTheme="majorHAnsi" w:hAnsiTheme="majorHAnsi"/>
                 <w:noProof/>
                 <w:color w:val="FF0000"/>
               </w:rPr>
             </w:pPr>
             <w:r>
               <w:rPr>
-                <w:rFonts w:ascii="Calibri" w:hAnsi="Calibri"/>
+                <w:rFonts w:asciiTheme="majorHAnsi" w:hAnsiTheme="majorHAnsi"/>
               </w:rPr>
               <w:t>5% standard (laden/unladen)</w:t>
             </w:r>
@@ -667,7 +764,15 @@
             <w:tcW w:w="2785" w:type="dxa"/>
           </w:tcPr>
           <w:p>
-            <w:r>
+            <w:pPr>
+              <w:rPr>
+                <w:rFonts w:asciiTheme="majorHAnsi" w:hAnsiTheme="majorHAnsi"/>
+              </w:rPr>
+            </w:pPr>
+            <w:r>
+              <w:rPr>
+                <w:rFonts w:asciiTheme="majorHAnsi" w:hAnsiTheme="majorHAnsi"/>
+              </w:rPr>
               <w:t>Spreader</w:t>
             </w:r>
           </w:p>
@@ -679,12 +784,14 @@
           <w:p>
             <w:pPr>
               <w:rPr>
+                <w:rFonts w:asciiTheme="majorHAnsi" w:hAnsiTheme="majorHAnsi"/>
                 <w:b/>
                 <w:bCs/>
               </w:rPr>
             </w:pPr>
             <w:r>
               <w:rPr>
+                <w:rFonts w:asciiTheme="majorHAnsi" w:hAnsiTheme="majorHAnsi"/>
                 <w:b/>
                 <w:bCs/>
               </w:rPr>
@@ -698,8 +805,14 @@
                 <w:ilvl w:val="0"/>
                 <w:numId w:val="2"/>
               </w:numPr>
-            </w:pPr>
-            <w:r>
+              <w:rPr>
+                <w:rFonts w:asciiTheme="majorHAnsi" w:hAnsiTheme="majorHAnsi"/>
+              </w:rPr>
+            </w:pPr>
+            <w:r>
+              <w:rPr>
+                <w:rFonts w:asciiTheme="majorHAnsi" w:hAnsiTheme="majorHAnsi"/>
+              </w:rPr>
               <w:t>6m fixed top-lift spreader with auxiliary chains for 12m containers</w:t>
             </w:r>
           </w:p>
@@ -710,20 +823,34 @@
                 <w:ilvl w:val="0"/>
                 <w:numId w:val="2"/>
               </w:numPr>
-            </w:pPr>
-            <w:r>
-              <w:t xml:space="preserve">6m – 12m telescoping top-lift spreader </w:t>
-            </w:r>
-          </w:p>
-        </w:tc>
-      </w:tr>
-      <w:tr>
-        <w:tc>
-          <w:tcPr>
-            <w:tcW w:w="2785" w:type="dxa"/>
-          </w:tcPr>
-          <w:p>
-            <w:r>
+              <w:rPr>
+                <w:rFonts w:asciiTheme="majorHAnsi" w:hAnsiTheme="majorHAnsi"/>
+              </w:rPr>
+            </w:pPr>
+            <w:r>
+              <w:rPr>
+                <w:rFonts w:asciiTheme="majorHAnsi" w:hAnsiTheme="majorHAnsi"/>
+              </w:rPr>
+              <w:t>6m – 12m telescoping top-lift spreader</w:t>
+            </w:r>
+          </w:p>
+        </w:tc>
+      </w:tr>
+      <w:tr>
+        <w:tc>
+          <w:tcPr>
+            <w:tcW w:w="2785" w:type="dxa"/>
+          </w:tcPr>
+          <w:p>
+            <w:pPr>
+              <w:rPr>
+                <w:rFonts w:asciiTheme="majorHAnsi" w:hAnsiTheme="majorHAnsi"/>
+              </w:rPr>
+            </w:pPr>
+            <w:r>
+              <w:rPr>
+                <w:rFonts w:asciiTheme="majorHAnsi" w:hAnsiTheme="majorHAnsi"/>
+              </w:rPr>
               <w:t>Suspension</w:t>
             </w:r>
           </w:p>
@@ -735,13 +862,14 @@
           <w:p>
             <w:pPr>
               <w:rPr>
+                <w:rFonts w:asciiTheme="majorHAnsi" w:hAnsiTheme="majorHAnsi"/>
                 <w:noProof/>
                 <w:color w:val="FF0000"/>
               </w:rPr>
             </w:pPr>
             <w:r>
               <w:rPr>
-                <w:rFonts w:ascii="Calibri" w:hAnsi="Calibri"/>
+                <w:rFonts w:asciiTheme="majorHAnsi" w:hAnsiTheme="majorHAnsi"/>
               </w:rPr>
               <w:t>Rigid mounting (no suspension)</w:t>
             </w:r>
@@ -754,9 +882,14 @@
             <w:tcW w:w="2785" w:type="dxa"/>
           </w:tcPr>
           <w:p>
-            <w:r>
-              <w:rPr>
-                <w:rFonts w:ascii="Calibri" w:hAnsi="Calibri"/>
+            <w:pPr>
+              <w:rPr>
+                <w:rFonts w:asciiTheme="majorHAnsi" w:hAnsiTheme="majorHAnsi"/>
+              </w:rPr>
+            </w:pPr>
+            <w:r>
+              <w:rPr>
+                <w:rFonts w:asciiTheme="majorHAnsi" w:hAnsiTheme="majorHAnsi"/>
               </w:rPr>
               <w:t>Spreader Side Shift</w:t>
             </w:r>
@@ -769,13 +902,14 @@
           <w:p>
             <w:pPr>
               <w:rPr>
+                <w:rFonts w:asciiTheme="majorHAnsi" w:hAnsiTheme="majorHAnsi"/>
                 <w:noProof/>
                 <w:color w:val="FF0000"/>
               </w:rPr>
             </w:pPr>
             <w:r>
               <w:rPr>
-                <w:rFonts w:ascii="Calibri" w:hAnsi="Calibri"/>
+                <w:rFonts w:asciiTheme="majorHAnsi" w:hAnsiTheme="majorHAnsi"/>
               </w:rPr>
               <w:t>±250 mm (independent control at each end, allowing skew adjustment)</w:t>
             </w:r>
@@ -788,9 +922,14 @@
             <w:tcW w:w="2785" w:type="dxa"/>
           </w:tcPr>
           <w:p>
-            <w:r>
-              <w:rPr>
-                <w:rFonts w:ascii="Calibri" w:hAnsi="Calibri"/>
+            <w:pPr>
+              <w:rPr>
+                <w:rFonts w:asciiTheme="majorHAnsi" w:hAnsiTheme="majorHAnsi"/>
+              </w:rPr>
+            </w:pPr>
+            <w:r>
+              <w:rPr>
+                <w:rFonts w:asciiTheme="majorHAnsi" w:hAnsiTheme="majorHAnsi"/>
               </w:rPr>
               <w:t>Braking</w:t>
             </w:r>
@@ -803,13 +942,14 @@
           <w:p>
             <w:pPr>
               <w:rPr>
+                <w:rFonts w:asciiTheme="majorHAnsi" w:hAnsiTheme="majorHAnsi"/>
                 <w:noProof/>
                 <w:color w:val="FF0000"/>
               </w:rPr>
             </w:pPr>
             <w:r>
               <w:rPr>
-                <w:rFonts w:ascii="Calibri" w:hAnsi="Calibri"/>
+                <w:rFonts w:asciiTheme="majorHAnsi" w:hAnsiTheme="majorHAnsi"/>
               </w:rPr>
               <w:t>Regenerative dynamic braking via electric motors</w:t>
             </w:r>
@@ -822,9 +962,14 @@
             <w:tcW w:w="2785" w:type="dxa"/>
           </w:tcPr>
           <w:p>
-            <w:r>
-              <w:rPr>
-                <w:rFonts w:ascii="Calibri" w:hAnsi="Calibri"/>
+            <w:pPr>
+              <w:rPr>
+                <w:rFonts w:asciiTheme="majorHAnsi" w:hAnsiTheme="majorHAnsi"/>
+              </w:rPr>
+            </w:pPr>
+            <w:r>
+              <w:rPr>
+                <w:rFonts w:asciiTheme="majorHAnsi" w:hAnsiTheme="majorHAnsi"/>
               </w:rPr>
               <w:t>Parking &amp; Emergency Brake</w:t>
             </w:r>
@@ -837,6 +982,7 @@
           <w:p>
             <w:pPr>
               <w:rPr>
+                <w:rFonts w:asciiTheme="majorHAnsi" w:hAnsiTheme="majorHAnsi"/>
                 <w:noProof/>
                 <w:color w:val="FF0000"/>
                 <w:lang w:val="vi-VN"/>
@@ -844,7 +990,7 @@
             </w:pPr>
             <w:r>
               <w:rPr>
-                <w:rFonts w:ascii="Calibri" w:hAnsi="Calibri"/>
+                <w:rFonts w:asciiTheme="majorHAnsi" w:hAnsiTheme="majorHAnsi"/>
               </w:rPr>
               <w:t>Fail-safe spring-applied, electro-hydraulically released safety brake on motor shaft / gearbox input</w:t>
             </w:r>
@@ -857,9 +1003,14 @@
             <w:tcW w:w="2785" w:type="dxa"/>
           </w:tcPr>
           <w:p>
-            <w:r>
-              <w:rPr>
-                <w:rFonts w:ascii="Calibri" w:hAnsi="Calibri"/>
+            <w:pPr>
+              <w:rPr>
+                <w:rFonts w:asciiTheme="majorHAnsi" w:hAnsiTheme="majorHAnsi"/>
+              </w:rPr>
+            </w:pPr>
+            <w:r>
+              <w:rPr>
+                <w:rFonts w:asciiTheme="majorHAnsi" w:hAnsiTheme="majorHAnsi"/>
               </w:rPr>
               <w:t>Drive</w:t>
             </w:r>
@@ -872,13 +1023,14 @@
           <w:p>
             <w:pPr>
               <w:rPr>
+                <w:rFonts w:asciiTheme="majorHAnsi" w:hAnsiTheme="majorHAnsi"/>
                 <w:noProof/>
                 <w:color w:val="FF0000"/>
               </w:rPr>
             </w:pPr>
             <w:r>
               <w:rPr>
-                <w:rFonts w:ascii="Calibri" w:hAnsi="Calibri"/>
+                <w:rFonts w:asciiTheme="majorHAnsi" w:hAnsiTheme="majorHAnsi"/>
               </w:rPr>
               <w:t>AC Electric Motors coupled to Planetary Gear Hubs - 4 Wheel Drive</w:t>
             </w:r>
@@ -891,30 +1043,34 @@
             <w:tcW w:w="2785" w:type="dxa"/>
           </w:tcPr>
           <w:p>
-            <w:proofErr w:type="spellStart"/>
-            <w:r>
-              <w:rPr>
-                <w:rFonts w:ascii="Calibri" w:hAnsi="Calibri"/>
+            <w:pPr>
+              <w:rPr>
+                <w:rFonts w:asciiTheme="majorHAnsi" w:hAnsiTheme="majorHAnsi"/>
+              </w:rPr>
+            </w:pPr>
+            <w:r>
+              <w:rPr>
+                <w:rFonts w:asciiTheme="majorHAnsi" w:hAnsiTheme="majorHAnsi"/>
               </w:rPr>
               <w:t>Tyres</w:t>
             </w:r>
-            <w:proofErr w:type="spellEnd"/>
-          </w:p>
-        </w:tc>
-        <w:tc>
-          <w:tcPr>
-            <w:tcW w:w="8005" w:type="dxa"/>
-          </w:tcPr>
-          <w:p>
-            <w:pPr>
-              <w:rPr>
+          </w:p>
+        </w:tc>
+        <w:tc>
+          <w:tcPr>
+            <w:tcW w:w="8005" w:type="dxa"/>
+          </w:tcPr>
+          <w:p>
+            <w:pPr>
+              <w:rPr>
+                <w:rFonts w:asciiTheme="majorHAnsi" w:hAnsiTheme="majorHAnsi"/>
                 <w:noProof/>
                 <w:color w:val="FF0000"/>
               </w:rPr>
             </w:pPr>
             <w:r>
               <w:rPr>
-                <w:rFonts w:ascii="Calibri" w:hAnsi="Calibri"/>
+                <w:rFonts w:asciiTheme="majorHAnsi" w:hAnsiTheme="majorHAnsi"/>
               </w:rPr>
               <w:t>Pneumatic, treaded</w:t>
             </w:r>
@@ -929,12 +1085,13 @@
           <w:p>
             <w:pPr>
               <w:rPr>
-                <w:color w:val="FF0000"/>
-              </w:rPr>
-            </w:pPr>
-            <w:r>
-              <w:rPr>
-                <w:rFonts w:ascii="Calibri" w:hAnsi="Calibri"/>
+                <w:rFonts w:asciiTheme="majorHAnsi" w:hAnsiTheme="majorHAnsi"/>
+                <w:color w:val="FF0000"/>
+              </w:rPr>
+            </w:pPr>
+            <w:r>
+              <w:rPr>
+                <w:rFonts w:asciiTheme="majorHAnsi" w:hAnsiTheme="majorHAnsi"/>
               </w:rPr>
               <w:t>Battery pack</w:t>
             </w:r>
@@ -947,13 +1104,14 @@
           <w:p>
             <w:pPr>
               <w:rPr>
+                <w:rFonts w:asciiTheme="majorHAnsi" w:hAnsiTheme="majorHAnsi"/>
                 <w:noProof/>
                 <w:color w:val="FF0000"/>
               </w:rPr>
             </w:pPr>
             <w:r>
               <w:rPr>
-                <w:rFonts w:ascii="Calibri" w:hAnsi="Calibri"/>
+                <w:rFonts w:asciiTheme="majorHAnsi" w:hAnsiTheme="majorHAnsi"/>
               </w:rPr>
               <w:t>CATL, 130 VDC nominal (114.52 kWh total capacity, 2x 57.26 kWh packs in series; designed for minimum 8 hours of continuous operation on a single charge under typical duty cycles)</w:t>
             </w:r>
@@ -966,9 +1124,14 @@
             <w:tcW w:w="2785" w:type="dxa"/>
           </w:tcPr>
           <w:p>
-            <w:r>
-              <w:rPr>
-                <w:rFonts w:ascii="Calibri" w:hAnsi="Calibri"/>
+            <w:pPr>
+              <w:rPr>
+                <w:rFonts w:asciiTheme="majorHAnsi" w:hAnsiTheme="majorHAnsi"/>
+              </w:rPr>
+            </w:pPr>
+            <w:r>
+              <w:rPr>
+                <w:rFonts w:asciiTheme="majorHAnsi" w:hAnsiTheme="majorHAnsi"/>
               </w:rPr>
               <w:t>Charging Time (to 80% SOC)</w:t>
             </w:r>
@@ -979,9 +1142,14 @@
             <w:tcW w:w="8005" w:type="dxa"/>
           </w:tcPr>
           <w:p>
-            <w:r>
-              <w:rPr>
-                <w:rFonts w:ascii="Calibri" w:hAnsi="Calibri"/>
+            <w:pPr>
+              <w:rPr>
+                <w:rFonts w:asciiTheme="majorHAnsi" w:hAnsiTheme="majorHAnsi"/>
+              </w:rPr>
+            </w:pPr>
+            <w:r>
+              <w:rPr>
+                <w:rFonts w:asciiTheme="majorHAnsi" w:hAnsiTheme="majorHAnsi"/>
               </w:rPr>
               <w:t>Approx. 4.5 to 6 hours with a 15–20 kW charger (from 10% SOC to 80% SOC)</w:t>
             </w:r>
@@ -996,51 +1164,217 @@
           <w:p>
             <w:pPr>
               <w:rPr>
-                <w:color w:val="FF0000"/>
-              </w:rPr>
-            </w:pPr>
-            <w:r>
+                <w:rFonts w:asciiTheme="majorHAnsi" w:hAnsiTheme="majorHAnsi"/>
+                <w:color w:val="FF0000"/>
+                <w:lang w:val="vi-VN"/>
+              </w:rPr>
+            </w:pPr>
+            <w:r>
+              <w:rPr>
+                <w:rFonts w:asciiTheme="majorHAnsi" w:hAnsiTheme="majorHAnsi"/>
+              </w:rPr>
               <w:t>Energy Consumption</w:t>
             </w:r>
-          </w:p>
-        </w:tc>
-        <w:tc>
-          <w:tcPr>
-            <w:tcW w:w="8005" w:type="dxa"/>
-          </w:tcPr>
-          <w:p>
-            <w:pPr>
-              <w:rPr>
+            <w:r>
+              <w:rPr>
+                <w:rFonts w:asciiTheme="majorHAnsi" w:hAnsiTheme="majorHAnsi"/>
+                <w:lang w:val="vi-VN"/>
+              </w:rPr>
+              <w:t xml:space="preserve"> (</w:t>
+            </w:r>
+            <w:r>
+              <w:rPr>
+                <w:rFonts w:asciiTheme="majorHAnsi" w:hAnsiTheme="majorHAnsi"/>
+              </w:rPr>
+              <w:t xml:space="preserve">80% </w:t>
+            </w:r>
+            <w:r>
+              <w:rPr>
+                <w:rFonts w:asciiTheme="majorHAnsi" w:hAnsiTheme="majorHAnsi"/>
+              </w:rPr>
+              <w:t>SOC</w:t>
+            </w:r>
+            <w:r>
+              <w:rPr>
+                <w:rFonts w:asciiTheme="majorHAnsi" w:hAnsiTheme="majorHAnsi"/>
+                <w:lang w:val="vi-VN"/>
+              </w:rPr>
+              <w:t>)</w:t>
+            </w:r>
+          </w:p>
+        </w:tc>
+        <w:tc>
+          <w:tcPr>
+            <w:tcW w:w="8005" w:type="dxa"/>
+          </w:tcPr>
+          <w:p>
+            <w:pPr>
+              <w:rPr>
+                <w:rFonts w:asciiTheme="majorHAnsi" w:hAnsiTheme="majorHAnsi"/>
+                <w:lang w:val="vi-VN"/>
+              </w:rPr>
+            </w:pPr>
+            <w:r>
+              <w:rPr>
+                <w:rFonts w:asciiTheme="majorHAnsi" w:hAnsiTheme="majorHAnsi"/>
+              </w:rPr>
+              <w:t xml:space="preserve">Traction: </w:t>
+            </w:r>
+          </w:p>
+          <w:p>
+            <w:pPr>
+              <w:pStyle w:val="ListParagraph"/>
+              <w:numPr>
+                <w:ilvl w:val="0"/>
+                <w:numId w:val="3"/>
+              </w:numPr>
+              <w:ind w:left="346"/>
+              <w:rPr>
+                <w:rFonts w:asciiTheme="majorHAnsi" w:hAnsiTheme="majorHAnsi"/>
+                <w:lang w:val="vi-VN"/>
+              </w:rPr>
+            </w:pPr>
+            <w:r>
+              <w:rPr>
+                <w:rFonts w:asciiTheme="majorHAnsi" w:hAnsiTheme="majorHAnsi"/>
+              </w:rPr>
+              <w:t>1.5 kWh/km unladen (12.0 kWh/h or 7.6 hours continuous travel at 8 km/h)</w:t>
+            </w:r>
+          </w:p>
+          <w:p>
+            <w:pPr>
+              <w:pStyle w:val="ListParagraph"/>
+              <w:numPr>
+                <w:ilvl w:val="0"/>
+                <w:numId w:val="3"/>
+              </w:numPr>
+              <w:ind w:left="346"/>
+              <w:rPr>
+                <w:rFonts w:asciiTheme="majorHAnsi" w:hAnsiTheme="majorHAnsi"/>
+                <w:lang w:val="vi-VN"/>
+              </w:rPr>
+            </w:pPr>
+            <w:r>
+              <w:rPr>
+                <w:rFonts w:asciiTheme="majorHAnsi" w:hAnsiTheme="majorHAnsi"/>
+              </w:rPr>
+              <w:t>3.5 kWh/km laden (17.5 kWh/h or 5.2 hours continuous travel at 5 km/h)</w:t>
+            </w:r>
+          </w:p>
+          <w:p>
+            <w:pPr>
+              <w:rPr>
+                <w:rFonts w:asciiTheme="majorHAnsi" w:hAnsiTheme="majorHAnsi"/>
+                <w:lang w:val="vi-VN"/>
+              </w:rPr>
+            </w:pPr>
+            <w:r>
+              <w:rPr>
+                <w:rFonts w:asciiTheme="majorHAnsi" w:hAnsiTheme="majorHAnsi"/>
+              </w:rPr>
+              <w:t xml:space="preserve">Hoist: </w:t>
+            </w:r>
+          </w:p>
+          <w:p>
+            <w:pPr>
+              <w:pStyle w:val="ListParagraph"/>
+              <w:numPr>
+                <w:ilvl w:val="0"/>
+                <w:numId w:val="3"/>
+              </w:numPr>
+              <w:ind w:left="346"/>
+              <w:rPr>
+                <w:rFonts w:asciiTheme="majorHAnsi" w:hAnsiTheme="majorHAnsi"/>
                 <w:b/>
                 <w:bCs/>
               </w:rPr>
             </w:pPr>
-            <w:r/>
-            <w:r>
-              <w:rPr>
-                <w:rFonts w:ascii="Calibri" w:hAnsi="Calibri"/>
-                <w:b w:val="0"/>
-              </w:rPr>
-              <w:t>Traction: ~1.5 kWh/km unladen (approx. 12.0 kWh/h or 7.6 hours continuous travel at 8 km/h on 80% SOC) to ~3.5 kWh/km laden (approx. 17.5 kWh/h or 5.2 hours continuous travel at 5 km/h on 80% SOC); Hoist: ~0.15 kWh/cycle net for 20T lift/lower (approx. 0.09 kWh/min or 14.8 hours continuous hoisting on 80% SOC); Standby: ~3.7 kWh/h with HVAC ON (approx. 24.8 hours continuous standby on 80% SOC) and ~0.33 kWh/h with HVAC OFF (approx. 277.6 hours continuous standby on 80% SOC)</w:t>
-            </w:r>
-          </w:p>
-        </w:tc>
-      </w:tr>
-      <w:tr>
-        <w:tc>
-          <w:tcPr>
-            <w:tcW w:w="2785" w:type="dxa"/>
-          </w:tcPr>
-          <w:p>
-            <w:pPr>
-              <w:rPr>
-                <w:color w:val="FF0000"/>
-              </w:rPr>
-            </w:pPr>
-            <w:r>
+            <w:r>
+              <w:rPr>
+                <w:rFonts w:asciiTheme="majorHAnsi" w:hAnsiTheme="majorHAnsi"/>
+              </w:rPr>
+              <w:t>0.15 kWh/cycle net for 20T lift/lower (approx. 0.09 kWh/min or 14.8 hours continuous hoisting)</w:t>
+            </w:r>
+          </w:p>
+          <w:p>
+            <w:pPr>
+              <w:rPr>
+                <w:rFonts w:asciiTheme="majorHAnsi" w:hAnsiTheme="majorHAnsi"/>
+                <w:lang w:val="vi-VN"/>
+              </w:rPr>
+            </w:pPr>
+            <w:r>
+              <w:rPr>
+                <w:rFonts w:asciiTheme="majorHAnsi" w:hAnsiTheme="majorHAnsi"/>
+              </w:rPr>
+              <w:t>Standby:</w:t>
+            </w:r>
+          </w:p>
+          <w:p>
+            <w:pPr>
+              <w:pStyle w:val="ListParagraph"/>
+              <w:numPr>
+                <w:ilvl w:val="0"/>
+                <w:numId w:val="3"/>
+              </w:numPr>
+              <w:ind w:left="346"/>
+              <w:rPr>
+                <w:rFonts w:asciiTheme="majorHAnsi" w:hAnsiTheme="majorHAnsi"/>
+                <w:lang w:val="vi-VN"/>
+              </w:rPr>
+            </w:pPr>
+            <w:r>
+              <w:rPr>
+                <w:rFonts w:asciiTheme="majorHAnsi" w:hAnsiTheme="majorHAnsi"/>
+              </w:rPr>
+              <w:t>3.7 kWh/h with HVAC ON (24.8 hours continuous standby)</w:t>
+            </w:r>
+          </w:p>
+          <w:p>
+            <w:pPr>
+              <w:pStyle w:val="ListParagraph"/>
+              <w:numPr>
+                <w:ilvl w:val="0"/>
+                <w:numId w:val="3"/>
+              </w:numPr>
+              <w:ind w:left="346"/>
+              <w:rPr>
+                <w:rFonts w:asciiTheme="majorHAnsi" w:hAnsiTheme="majorHAnsi"/>
+                <w:b/>
+                <w:bCs/>
+              </w:rPr>
+            </w:pPr>
+            <w:r>
+              <w:rPr>
+                <w:rFonts w:asciiTheme="majorHAnsi" w:hAnsiTheme="majorHAnsi"/>
+              </w:rPr>
+              <w:t>0.33 kWh/h with HVAC OFF (277.6 hours continuous standby)</w:t>
+            </w:r>
+          </w:p>
+        </w:tc>
+      </w:tr>
+      <w:tr>
+        <w:tc>
+          <w:tcPr>
+            <w:tcW w:w="2785" w:type="dxa"/>
+          </w:tcPr>
+          <w:p>
+            <w:pPr>
+              <w:rPr>
+                <w:rFonts w:asciiTheme="majorHAnsi" w:hAnsiTheme="majorHAnsi"/>
+                <w:color w:val="FF0000"/>
+              </w:rPr>
+            </w:pPr>
+            <w:r>
+              <w:rPr>
+                <w:rFonts w:asciiTheme="majorHAnsi" w:hAnsiTheme="majorHAnsi"/>
+              </w:rPr>
               <w:t xml:space="preserve">Regenerative </w:t>
             </w:r>
             <w:r>
+              <w:rPr>
+                <w:rFonts w:asciiTheme="majorHAnsi" w:hAnsiTheme="majorHAnsi"/>
+              </w:rPr>
               <w:t xml:space="preserve">Energy </w:t>
             </w:r>
           </w:p>
@@ -1050,48 +1384,81 @@
             <w:tcW w:w="8005" w:type="dxa"/>
           </w:tcPr>
           <w:p>
-            <w:r/>
-            <w:r>
-              <w:rPr>
-                <w:rFonts w:ascii="Calibri" w:hAnsi="Calibri"/>
-              </w:rPr>
-              <w:t>15-25% recovery (Traction/Travel), up to 45-50% recovery (Winch/Lowering 20T load)</w:t>
-            </w:r>
-          </w:p>
-        </w:tc>
-      </w:tr>
-      <w:tr>
-        <w:tc>
-          <w:tcPr>
-            <w:tcW w:type="dxa" w:w="2785"/>
-          </w:tcPr>
-          <w:p>
-            <w:r/>
-            <w:r>
-              <w:rPr>
-                <w:rFonts w:ascii="Calibri" w:hAnsi="Calibri"/>
-              </w:rPr>
+            <w:pPr>
+              <w:rPr>
+                <w:rFonts w:asciiTheme="majorHAnsi" w:hAnsiTheme="majorHAnsi"/>
+              </w:rPr>
+            </w:pPr>
+            <w:r>
+              <w:rPr>
+                <w:rFonts w:asciiTheme="majorHAnsi" w:hAnsiTheme="majorHAnsi"/>
+              </w:rPr>
+              <w:t>15-25% recovery (Traction/Travel), up to 45-50% recovery (Winch/Lowering load)</w:t>
+            </w:r>
+          </w:p>
+        </w:tc>
+      </w:tr>
+      <w:tr>
+        <w:tc>
+          <w:tcPr>
+            <w:tcW w:w="2785" w:type="dxa"/>
+          </w:tcPr>
+          <w:p>
+            <w:pPr>
+              <w:rPr>
+                <w:rFonts w:asciiTheme="majorHAnsi" w:hAnsiTheme="majorHAnsi"/>
+              </w:rPr>
+            </w:pPr>
+            <w:r>
+              <w:rPr>
+                <w:rFonts w:asciiTheme="majorHAnsi" w:hAnsiTheme="majorHAnsi"/>
+              </w:rPr>
+              <w:lastRenderedPageBreak/>
               <w:t>Projected Winch Cycles (80% SOC)</w:t>
             </w:r>
           </w:p>
         </w:tc>
         <w:tc>
           <w:tcPr>
-            <w:tcW w:type="dxa" w:w="8005"/>
-          </w:tcPr>
-          <w:p>
-            <w:r/>
-            <w:r>
-              <w:rPr>
-                <w:rFonts w:ascii="Calibri" w:hAnsi="Calibri"/>
+            <w:tcW w:w="8005" w:type="dxa"/>
+          </w:tcPr>
+          <w:p>
+            <w:pPr>
+              <w:rPr>
+                <w:rFonts w:asciiTheme="majorHAnsi" w:hAnsiTheme="majorHAnsi"/>
+              </w:rPr>
+            </w:pPr>
+            <w:r>
+              <w:rPr>
+                <w:rFonts w:asciiTheme="majorHAnsi" w:hAnsiTheme="majorHAnsi"/>
               </w:rPr>
               <w:t>Projected raise/lower cycles using 80% of battery capacity (91.62 kWh usable)</w:t>
+            </w:r>
+            <w:r>
+              <w:rPr>
+                <w:rFonts w:asciiTheme="majorHAnsi" w:hAnsiTheme="majorHAnsi"/>
+              </w:rPr>
               <w:br/>
               <w:t>• Without regenerative energy recovery (Gross consumption limit):</w:t>
+            </w:r>
+            <w:r>
+              <w:rPr>
+                <w:rFonts w:asciiTheme="majorHAnsi" w:hAnsiTheme="majorHAnsi"/>
+              </w:rPr>
               <w:br/>
               <w:t>The crane can perform 280 continuous raise and lower cycles.</w:t>
+            </w:r>
+            <w:r>
+              <w:rPr>
+                <w:rFonts w:asciiTheme="majorHAnsi" w:hAnsiTheme="majorHAnsi"/>
+              </w:rPr>
               <w:br/>
               <w:t>• With regenerative energy recovery (Actual net consumption):</w:t>
+            </w:r>
+            <w:r>
+              <w:rPr>
+                <w:rFonts w:asciiTheme="majorHAnsi" w:hAnsiTheme="majorHAnsi"/>
+              </w:rPr>
               <w:br/>
               <w:t>The crane can perform 536 continuous raise and lower cycles. (The actual number of cycles will range from 280 to 536 depending on battery charging/discharging efficiency and thermal losses).</w:t>
             </w:r>
@@ -1106,10 +1473,14 @@
           <w:p>
             <w:pPr>
               <w:rPr>
-                <w:color w:val="FF0000"/>
-              </w:rPr>
-            </w:pPr>
-            <w:r>
+                <w:rFonts w:asciiTheme="majorHAnsi" w:hAnsiTheme="majorHAnsi"/>
+                <w:color w:val="FF0000"/>
+              </w:rPr>
+            </w:pPr>
+            <w:r>
+              <w:rPr>
+                <w:rFonts w:asciiTheme="majorHAnsi" w:hAnsiTheme="majorHAnsi"/>
+              </w:rPr>
               <w:t>Warning Devices</w:t>
             </w:r>
           </w:p>
@@ -1121,19 +1492,20 @@
           <w:p>
             <w:pPr>
               <w:rPr>
+                <w:rFonts w:asciiTheme="majorHAnsi" w:hAnsiTheme="majorHAnsi"/>
                 <w:b/>
                 <w:bCs/>
               </w:rPr>
             </w:pPr>
             <w:r>
               <w:rPr>
-                <w:rFonts w:ascii="Calibri" w:hAnsi="Calibri"/>
+                <w:rFonts w:asciiTheme="majorHAnsi" w:hAnsiTheme="majorHAnsi"/>
               </w:rPr>
               <w:t>4</w:t>
             </w:r>
             <w:r>
               <w:rPr>
-                <w:rFonts w:ascii="Calibri" w:hAnsi="Calibri"/>
+                <w:rFonts w:asciiTheme="majorHAnsi" w:hAnsiTheme="majorHAnsi"/>
               </w:rPr>
               <w:t>x Flashing amber travel beacons, 1x Audible backup beeper, Horn</w:t>
             </w:r>
@@ -1148,12 +1520,13 @@
           <w:p>
             <w:pPr>
               <w:rPr>
-                <w:color w:val="FF0000"/>
-              </w:rPr>
-            </w:pPr>
-            <w:r>
-              <w:rPr>
-                <w:rFonts w:ascii="Calibri" w:hAnsi="Calibri"/>
+                <w:rFonts w:asciiTheme="majorHAnsi" w:hAnsiTheme="majorHAnsi"/>
+                <w:color w:val="FF0000"/>
+              </w:rPr>
+            </w:pPr>
+            <w:r>
+              <w:rPr>
+                <w:rFonts w:asciiTheme="majorHAnsi" w:hAnsiTheme="majorHAnsi"/>
               </w:rPr>
               <w:t>Machine Weight (6m-12m Spreader)</w:t>
             </w:r>
@@ -1166,13 +1539,14 @@
           <w:p>
             <w:pPr>
               <w:rPr>
+                <w:rFonts w:asciiTheme="majorHAnsi" w:hAnsiTheme="majorHAnsi"/>
                 <w:noProof/>
                 <w:color w:val="FF0000"/>
               </w:rPr>
             </w:pPr>
             <w:r>
               <w:rPr>
-                <w:rFonts w:ascii="Calibri" w:hAnsi="Calibri"/>
+                <w:rFonts w:asciiTheme="majorHAnsi" w:hAnsiTheme="majorHAnsi"/>
                 <w:color w:val="EE0000"/>
               </w:rPr>
               <w:t>17 Tons (approx. with 6m-12m telescoping spreader)</w:t>
@@ -1188,10 +1562,14 @@
           <w:p>
             <w:pPr>
               <w:rPr>
-                <w:color w:val="FF0000"/>
-              </w:rPr>
-            </w:pPr>
-            <w:r>
+                <w:rFonts w:asciiTheme="majorHAnsi" w:hAnsiTheme="majorHAnsi"/>
+                <w:color w:val="FF0000"/>
+              </w:rPr>
+            </w:pPr>
+            <w:r>
+              <w:rPr>
+                <w:rFonts w:asciiTheme="majorHAnsi" w:hAnsiTheme="majorHAnsi"/>
+              </w:rPr>
               <w:t>Max. Wheel Load</w:t>
             </w:r>
           </w:p>
@@ -1203,48 +1581,37 @@
           <w:p>
             <w:pPr>
               <w:rPr>
+                <w:rFonts w:asciiTheme="majorHAnsi" w:hAnsiTheme="majorHAnsi"/>
                 <w:noProof/>
                 <w:color w:val="FF0000"/>
               </w:rPr>
             </w:pPr>
             <w:r>
               <w:rPr>
-                <w:rFonts w:ascii="Calibri" w:hAnsi="Calibri"/>
+                <w:rFonts w:asciiTheme="majorHAnsi" w:hAnsiTheme="majorHAnsi"/>
                 <w:color w:val="EE0000"/>
               </w:rPr>
-              <w:t xml:space="preserve">18 Tons (or 180 </w:t>
-            </w:r>
-            <w:proofErr w:type="spellStart"/>
-            <w:r>
-              <w:rPr>
-                <w:rFonts w:ascii="Calibri" w:hAnsi="Calibri"/>
-                <w:color w:val="EE0000"/>
-              </w:rPr>
-              <w:t>kN</w:t>
-            </w:r>
-            <w:proofErr w:type="spellEnd"/>
-            <w:r>
-              <w:rPr>
-                <w:rFonts w:ascii="Calibri" w:hAnsi="Calibri"/>
-                <w:color w:val="EE0000"/>
-              </w:rPr>
-              <w:t>)</w:t>
-            </w:r>
-          </w:p>
-        </w:tc>
-      </w:tr>
-      <w:tr>
-        <w:tc>
-          <w:tcPr>
-            <w:tcW w:w="2785" w:type="dxa"/>
-          </w:tcPr>
-          <w:p>
-            <w:pPr>
-              <w:rPr>
-                <w:color w:val="FF0000"/>
-              </w:rPr>
-            </w:pPr>
-            <w:r>
+              <w:t>18 Tons (or 180 kN)</w:t>
+            </w:r>
+          </w:p>
+        </w:tc>
+      </w:tr>
+      <w:tr>
+        <w:tc>
+          <w:tcPr>
+            <w:tcW w:w="2785" w:type="dxa"/>
+          </w:tcPr>
+          <w:p>
+            <w:pPr>
+              <w:rPr>
+                <w:rFonts w:asciiTheme="majorHAnsi" w:hAnsiTheme="majorHAnsi"/>
+                <w:color w:val="FF0000"/>
+              </w:rPr>
+            </w:pPr>
+            <w:r>
+              <w:rPr>
+                <w:rFonts w:asciiTheme="majorHAnsi" w:hAnsiTheme="majorHAnsi"/>
+              </w:rPr>
               <w:t>Lights</w:t>
             </w:r>
           </w:p>
@@ -1256,11 +1623,15 @@
           <w:p>
             <w:pPr>
               <w:rPr>
+                <w:rFonts w:asciiTheme="majorHAnsi" w:hAnsiTheme="majorHAnsi"/>
                 <w:noProof/>
                 <w:color w:val="FF0000"/>
               </w:rPr>
             </w:pPr>
             <w:r>
+              <w:rPr>
+                <w:rFonts w:asciiTheme="majorHAnsi" w:hAnsiTheme="majorHAnsi"/>
+              </w:rPr>
               <w:t>Working lights, Driving lights, Side lights</w:t>
             </w:r>
           </w:p>
@@ -1274,10 +1645,14 @@
           <w:p>
             <w:pPr>
               <w:rPr>
-                <w:color w:val="FF0000"/>
-              </w:rPr>
-            </w:pPr>
-            <w:r>
+                <w:rFonts w:asciiTheme="majorHAnsi" w:hAnsiTheme="majorHAnsi"/>
+                <w:color w:val="FF0000"/>
+              </w:rPr>
+            </w:pPr>
+            <w:r>
+              <w:rPr>
+                <w:rFonts w:asciiTheme="majorHAnsi" w:hAnsiTheme="majorHAnsi"/>
+              </w:rPr>
               <w:t>Camera</w:t>
             </w:r>
           </w:p>
@@ -1289,78 +1664,20 @@
           <w:p>
             <w:pPr>
               <w:rPr>
+                <w:rFonts w:asciiTheme="majorHAnsi" w:hAnsiTheme="majorHAnsi"/>
                 <w:noProof/>
                 <w:color w:val="FF0000"/>
               </w:rPr>
             </w:pPr>
             <w:r>
+              <w:rPr>
+                <w:rFonts w:asciiTheme="majorHAnsi" w:hAnsiTheme="majorHAnsi"/>
+              </w:rPr>
               <w:t>Camera with Split Screen in Cab</w:t>
             </w:r>
           </w:p>
         </w:tc>
       </w:tr>
-    </w:tbl>
-    <w:p>
-      <w:pPr>
-        <w:rPr>
-          <w:color w:val="FF0000"/>
-        </w:rPr>
-      </w:pPr>
-      <w:r>
-        <w:rPr>
-          <w:color w:val="FF0000"/>
-        </w:rPr>
-        <w:tab/>
-      </w:r>
-      <w:r>
-        <w:rPr>
-          <w:color w:val="FF0000"/>
-        </w:rPr>
-        <w:tab/>
-      </w:r>
-    </w:p>
-    <w:p>
-      <w:r>
-        <w:tab/>
-      </w:r>
-      <w:r>
-        <w:tab/>
-      </w:r>
-      <w:r>
-        <w:tab/>
-      </w:r>
-    </w:p>
-    <w:p>
-      <w:r>
-        <w:tab/>
-      </w:r>
-      <w:r>
-        <w:tab/>
-      </w:r>
-    </w:p>
-    <w:p>
-      <w:r>
-        <w:tab/>
-      </w:r>
-    </w:p>
-    <w:p/>
-    <w:p/>
-    <w:p/>
-    <w:p/>
-    <w:p/>
-    <w:p/>
-    <w:p/>
-    <w:p/>
-    <w:tbl>
-      <w:tblPr>
-        <w:tblStyle w:val="TableGrid"/>
-        <w:tblW w:w="0" w:type="auto"/>
-        <w:tblLook w:val="04A0" w:firstRow="1" w:lastRow="0" w:firstColumn="1" w:lastColumn="0" w:noHBand="0" w:noVBand="1"/>
-      </w:tblPr>
-      <w:tblGrid>
-        <w:gridCol w:w="2785"/>
-        <w:gridCol w:w="8005"/>
-      </w:tblGrid>
       <w:tr>
         <w:tc>
           <w:tcPr>
@@ -1397,10 +1714,14 @@
           <w:p>
             <w:pPr>
               <w:rPr>
-                <w:color w:val="FF0000"/>
-              </w:rPr>
-            </w:pPr>
-            <w:r>
+                <w:rFonts w:asciiTheme="majorHAnsi" w:hAnsiTheme="majorHAnsi"/>
+                <w:color w:val="FF0000"/>
+              </w:rPr>
+            </w:pPr>
+            <w:r>
+              <w:rPr>
+                <w:rFonts w:asciiTheme="majorHAnsi" w:hAnsiTheme="majorHAnsi"/>
+              </w:rPr>
               <w:t>Cab Position</w:t>
             </w:r>
           </w:p>
@@ -1412,13 +1733,14 @@
           <w:p>
             <w:pPr>
               <w:rPr>
+                <w:rFonts w:asciiTheme="majorHAnsi" w:hAnsiTheme="majorHAnsi"/>
                 <w:noProof/>
                 <w:color w:val="FF0000"/>
               </w:rPr>
             </w:pPr>
             <w:r>
               <w:rPr>
-                <w:rFonts w:ascii="Calibri" w:hAnsi="Calibri"/>
+                <w:rFonts w:asciiTheme="majorHAnsi" w:hAnsiTheme="majorHAnsi"/>
               </w:rPr>
               <w:t>Above side beam</w:t>
             </w:r>
@@ -1433,12 +1755,13 @@
           <w:p>
             <w:pPr>
               <w:rPr>
-                <w:color w:val="FF0000"/>
-              </w:rPr>
-            </w:pPr>
-            <w:r>
-              <w:rPr>
-                <w:rFonts w:ascii="Calibri" w:hAnsi="Calibri"/>
+                <w:rFonts w:asciiTheme="majorHAnsi" w:hAnsiTheme="majorHAnsi"/>
+                <w:color w:val="FF0000"/>
+              </w:rPr>
+            </w:pPr>
+            <w:r>
+              <w:rPr>
+                <w:rFonts w:asciiTheme="majorHAnsi" w:hAnsiTheme="majorHAnsi"/>
               </w:rPr>
               <w:t>Cab Type</w:t>
             </w:r>
@@ -1451,13 +1774,14 @@
           <w:p>
             <w:pPr>
               <w:rPr>
+                <w:rFonts w:asciiTheme="majorHAnsi" w:hAnsiTheme="majorHAnsi"/>
                 <w:noProof/>
                 <w:color w:val="FF0000"/>
               </w:rPr>
             </w:pPr>
             <w:r>
               <w:rPr>
-                <w:rFonts w:ascii="Calibri" w:hAnsi="Calibri"/>
+                <w:rFonts w:asciiTheme="majorHAnsi" w:hAnsiTheme="majorHAnsi"/>
               </w:rPr>
               <w:t>Fully enclosed with sliding window, isolation mounted</w:t>
             </w:r>
@@ -1472,12 +1796,12 @@
           <w:p>
             <w:pPr>
               <w:rPr>
-                <w:color w:val="00B0F0"/>
-              </w:rPr>
-            </w:pPr>
-            <w:r>
-              <w:rPr>
-                <w:color w:val="00B0F0"/>
+                <w:rFonts w:asciiTheme="majorHAnsi" w:hAnsiTheme="majorHAnsi"/>
+              </w:rPr>
+            </w:pPr>
+            <w:r>
+              <w:rPr>
+                <w:rFonts w:asciiTheme="majorHAnsi" w:hAnsiTheme="majorHAnsi"/>
               </w:rPr>
               <w:t>Air Conditioning</w:t>
             </w:r>
@@ -1490,13 +1814,13 @@
           <w:p>
             <w:pPr>
               <w:rPr>
+                <w:rFonts w:asciiTheme="majorHAnsi" w:hAnsiTheme="majorHAnsi"/>
                 <w:noProof/>
-                <w:color w:val="00B0F0"/>
-              </w:rPr>
-            </w:pPr>
-            <w:r>
-              <w:rPr>
-                <w:color w:val="00B0F0"/>
+              </w:rPr>
+            </w:pPr>
+            <w:r>
+              <w:rPr>
+                <w:rFonts w:asciiTheme="majorHAnsi" w:hAnsiTheme="majorHAnsi"/>
               </w:rPr>
               <w:t>Cooling/Heat</w:t>
             </w:r>
@@ -1511,12 +1835,12 @@
           <w:p>
             <w:pPr>
               <w:rPr>
-                <w:color w:val="FF0000"/>
-              </w:rPr>
-            </w:pPr>
-            <w:r>
-              <w:rPr>
-                <w:color w:val="00B0F0"/>
+                <w:rFonts w:asciiTheme="majorHAnsi" w:hAnsiTheme="majorHAnsi"/>
+              </w:rPr>
+            </w:pPr>
+            <w:r>
+              <w:rPr>
+                <w:rFonts w:asciiTheme="majorHAnsi" w:hAnsiTheme="majorHAnsi"/>
               </w:rPr>
               <w:t>Control Console</w:t>
             </w:r>
@@ -1529,13 +1853,12 @@
           <w:p>
             <w:pPr>
               <w:rPr>
-                <w:color w:val="00B0F0"/>
-              </w:rPr>
-            </w:pPr>
-            <w:r>
-              <w:rPr>
-                <w:rFonts w:ascii="Calibri" w:hAnsi="Calibri"/>
-                <w:color w:val="00B0F0"/>
+                <w:rFonts w:asciiTheme="majorHAnsi" w:hAnsiTheme="majorHAnsi"/>
+              </w:rPr>
+            </w:pPr>
+            <w:r>
+              <w:rPr>
+                <w:rFonts w:asciiTheme="majorHAnsi" w:hAnsiTheme="majorHAnsi"/>
               </w:rPr>
               <w:t>Full operational control is from the cab</w:t>
             </w:r>
@@ -1550,12 +1873,13 @@
           <w:p>
             <w:pPr>
               <w:rPr>
-                <w:color w:val="FF0000"/>
-              </w:rPr>
-            </w:pPr>
-            <w:r>
-              <w:rPr>
-                <w:rFonts w:ascii="Calibri" w:hAnsi="Calibri"/>
+                <w:rFonts w:asciiTheme="majorHAnsi" w:hAnsiTheme="majorHAnsi"/>
+                <w:color w:val="FF0000"/>
+              </w:rPr>
+            </w:pPr>
+            <w:r>
+              <w:rPr>
+                <w:rFonts w:asciiTheme="majorHAnsi" w:hAnsiTheme="majorHAnsi"/>
               </w:rPr>
               <w:t>Operator indicators</w:t>
             </w:r>
@@ -1568,6 +1892,7 @@
           <w:p>
             <w:pPr>
               <w:rPr>
+                <w:rFonts w:asciiTheme="majorHAnsi" w:hAnsiTheme="majorHAnsi"/>
                 <w:noProof/>
                 <w:color w:val="FF0000"/>
                 <w:lang w:val="vi-VN"/>
@@ -1575,33 +1900,19 @@
             </w:pPr>
             <w:r>
               <w:rPr>
-                <w:rFonts w:ascii="Calibri" w:hAnsi="Calibri"/>
-              </w:rPr>
-              <w:t>Touchscreen display (HMI) for vehicle telemetry, including battery state of charge (SOC), system diagnostic codes, steering mode, and spreader status (</w:t>
-            </w:r>
-            <w:proofErr w:type="spellStart"/>
-            <w:r>
-              <w:rPr>
-                <w:rFonts w:ascii="Calibri" w:hAnsi="Calibri"/>
-              </w:rPr>
-              <w:t>twistlocks</w:t>
-            </w:r>
-            <w:proofErr w:type="spellEnd"/>
-            <w:r>
-              <w:rPr>
-                <w:rFonts w:ascii="Calibri" w:hAnsi="Calibri"/>
-              </w:rPr>
-              <w:t xml:space="preserve"> locked/unlocked, spreader </w:t>
-            </w:r>
-            <w:r>
-              <w:rPr>
-                <w:rFonts w:ascii="Calibri" w:hAnsi="Calibri"/>
+                <w:rFonts w:asciiTheme="majorHAnsi" w:hAnsiTheme="majorHAnsi"/>
+              </w:rPr>
+              <w:t xml:space="preserve">Touchscreen display (HMI) for vehicle telemetry, including battery state of charge (SOC), system diagnostic codes, steering mode, and spreader status (twistlocks locked/unlocked, spreader </w:t>
+            </w:r>
+            <w:r>
+              <w:rPr>
+                <w:rFonts w:asciiTheme="majorHAnsi" w:hAnsiTheme="majorHAnsi"/>
               </w:rPr>
               <w:t>position</w:t>
             </w:r>
             <w:r>
               <w:rPr>
-                <w:rFonts w:ascii="Calibri" w:hAnsi="Calibri"/>
+                <w:rFonts w:asciiTheme="majorHAnsi" w:hAnsiTheme="majorHAnsi"/>
               </w:rPr>
               <w:t>).</w:t>
             </w:r>
@@ -1616,12 +1927,13 @@
           <w:p>
             <w:pPr>
               <w:rPr>
-                <w:color w:val="FF0000"/>
-              </w:rPr>
-            </w:pPr>
-            <w:r>
-              <w:rPr>
-                <w:rFonts w:ascii="Calibri" w:hAnsi="Calibri"/>
+                <w:rFonts w:asciiTheme="majorHAnsi" w:hAnsiTheme="majorHAnsi"/>
+                <w:color w:val="FF0000"/>
+              </w:rPr>
+            </w:pPr>
+            <w:r>
+              <w:rPr>
+                <w:rFonts w:asciiTheme="majorHAnsi" w:hAnsiTheme="majorHAnsi"/>
               </w:rPr>
               <w:t>Steering control</w:t>
             </w:r>
@@ -1634,13 +1946,14 @@
           <w:p>
             <w:pPr>
               <w:rPr>
+                <w:rFonts w:asciiTheme="majorHAnsi" w:hAnsiTheme="majorHAnsi"/>
                 <w:noProof/>
                 <w:color w:val="FF0000"/>
               </w:rPr>
             </w:pPr>
             <w:r>
               <w:rPr>
-                <w:rFonts w:ascii="Calibri" w:hAnsi="Calibri"/>
+                <w:rFonts w:asciiTheme="majorHAnsi" w:hAnsiTheme="majorHAnsi"/>
               </w:rPr>
               <w:t>Joystick Right (Y-axis)</w:t>
             </w:r>
@@ -1655,12 +1968,13 @@
           <w:p>
             <w:pPr>
               <w:rPr>
-                <w:color w:val="FF0000"/>
-              </w:rPr>
-            </w:pPr>
-            <w:r>
-              <w:rPr>
-                <w:rFonts w:ascii="Calibri" w:hAnsi="Calibri"/>
+                <w:rFonts w:asciiTheme="majorHAnsi" w:hAnsiTheme="majorHAnsi"/>
+                <w:color w:val="FF0000"/>
+              </w:rPr>
+            </w:pPr>
+            <w:r>
+              <w:rPr>
+                <w:rFonts w:asciiTheme="majorHAnsi" w:hAnsiTheme="majorHAnsi"/>
               </w:rPr>
               <w:t>Hoist control</w:t>
             </w:r>
@@ -1673,13 +1987,14 @@
           <w:p>
             <w:pPr>
               <w:rPr>
+                <w:rFonts w:asciiTheme="majorHAnsi" w:hAnsiTheme="majorHAnsi"/>
                 <w:noProof/>
                 <w:color w:val="FF0000"/>
               </w:rPr>
             </w:pPr>
             <w:r>
               <w:rPr>
-                <w:rFonts w:ascii="Calibri" w:hAnsi="Calibri"/>
+                <w:rFonts w:asciiTheme="majorHAnsi" w:hAnsiTheme="majorHAnsi"/>
               </w:rPr>
               <w:t>Scroll button on Joystick Right</w:t>
             </w:r>
@@ -1692,9 +2007,14 @@
             <w:tcW w:w="2785" w:type="dxa"/>
           </w:tcPr>
           <w:p>
-            <w:r>
-              <w:rPr>
-                <w:rFonts w:ascii="Calibri" w:hAnsi="Calibri"/>
+            <w:pPr>
+              <w:rPr>
+                <w:rFonts w:asciiTheme="majorHAnsi" w:hAnsiTheme="majorHAnsi"/>
+              </w:rPr>
+            </w:pPr>
+            <w:r>
+              <w:rPr>
+                <w:rFonts w:asciiTheme="majorHAnsi" w:hAnsiTheme="majorHAnsi"/>
               </w:rPr>
               <w:t>Travel control</w:t>
             </w:r>
@@ -1705,9 +2025,14 @@
             <w:tcW w:w="8005" w:type="dxa"/>
           </w:tcPr>
           <w:p>
-            <w:r>
-              <w:rPr>
-                <w:rFonts w:ascii="Calibri" w:hAnsi="Calibri"/>
+            <w:pPr>
+              <w:rPr>
+                <w:rFonts w:asciiTheme="majorHAnsi" w:hAnsiTheme="majorHAnsi"/>
+              </w:rPr>
+            </w:pPr>
+            <w:r>
+              <w:rPr>
+                <w:rFonts w:asciiTheme="majorHAnsi" w:hAnsiTheme="majorHAnsi"/>
               </w:rPr>
               <w:t>Joystick Left (Y-axis): Push forward to travel Forward, pull backward to travel Reverse</w:t>
             </w:r>
@@ -1722,12 +2047,13 @@
           <w:p>
             <w:pPr>
               <w:rPr>
-                <w:color w:val="FF0000"/>
-              </w:rPr>
-            </w:pPr>
-            <w:r>
-              <w:rPr>
-                <w:rFonts w:ascii="Calibri" w:hAnsi="Calibri"/>
+                <w:rFonts w:asciiTheme="majorHAnsi" w:hAnsiTheme="majorHAnsi"/>
+                <w:color w:val="FF0000"/>
+              </w:rPr>
+            </w:pPr>
+            <w:r>
+              <w:rPr>
+                <w:rFonts w:asciiTheme="majorHAnsi" w:hAnsiTheme="majorHAnsi"/>
               </w:rPr>
               <w:t>Spreader control</w:t>
             </w:r>
@@ -1740,83 +2066,35 @@
           <w:p>
             <w:pPr>
               <w:rPr>
+                <w:rFonts w:asciiTheme="majorHAnsi" w:hAnsiTheme="majorHAnsi"/>
                 <w:noProof/>
                 <w:color w:val="FF0000"/>
               </w:rPr>
             </w:pPr>
-            <w:proofErr w:type="spellStart"/>
-            <w:r>
-              <w:rPr>
-                <w:rFonts w:ascii="Calibri" w:hAnsi="Calibri"/>
-              </w:rPr>
-              <w:t>Twistlocks</w:t>
-            </w:r>
-            <w:proofErr w:type="spellEnd"/>
-            <w:r>
-              <w:rPr>
-                <w:rFonts w:ascii="Calibri" w:hAnsi="Calibri"/>
-              </w:rPr>
-              <w:t xml:space="preserve">: Buttons on Right joystick head (Bit 0: Lock, Bit 1: Unlock). Telescoping: Buttons on Right joystick head (Bit 2: Retract, Bit 3: Extend). </w:t>
-            </w:r>
-            <w:proofErr w:type="spellStart"/>
-            <w:r>
-              <w:rPr>
-                <w:rFonts w:ascii="Calibri" w:hAnsi="Calibri"/>
-              </w:rPr>
-              <w:t>Sideshift</w:t>
-            </w:r>
-            <w:proofErr w:type="spellEnd"/>
-            <w:r>
-              <w:rPr>
-                <w:rFonts w:ascii="Calibri" w:hAnsi="Calibri"/>
-              </w:rPr>
-              <w:t>: Left joystick X-axis (</w:t>
-            </w:r>
-            <w:proofErr w:type="spellStart"/>
-            <w:r>
-              <w:rPr>
-                <w:rFonts w:ascii="Calibri" w:hAnsi="Calibri"/>
-              </w:rPr>
-              <w:t>Sideshift</w:t>
-            </w:r>
-            <w:proofErr w:type="spellEnd"/>
-            <w:r>
-              <w:rPr>
-                <w:rFonts w:ascii="Calibri" w:hAnsi="Calibri"/>
-              </w:rPr>
-              <w:t xml:space="preserve"> AB) and Right joystick X-axis (</w:t>
-            </w:r>
-            <w:proofErr w:type="spellStart"/>
-            <w:r>
-              <w:rPr>
-                <w:rFonts w:ascii="Calibri" w:hAnsi="Calibri"/>
-              </w:rPr>
-              <w:t>Sideshift</w:t>
-            </w:r>
-            <w:proofErr w:type="spellEnd"/>
-            <w:r>
-              <w:rPr>
-                <w:rFonts w:ascii="Calibri" w:hAnsi="Calibri"/>
-              </w:rPr>
-              <w:t xml:space="preserve"> CD) for independent control and skew adjustment.</w:t>
-            </w:r>
-          </w:p>
-        </w:tc>
-      </w:tr>
-      <w:tr>
-        <w:tc>
-          <w:tcPr>
-            <w:tcW w:w="2785" w:type="dxa"/>
-          </w:tcPr>
-          <w:p>
-            <w:pPr>
-              <w:rPr>
-                <w:color w:val="FF0000"/>
-              </w:rPr>
-            </w:pPr>
-            <w:r>
-              <w:rPr>
-                <w:rFonts w:ascii="Calibri" w:hAnsi="Calibri"/>
+            <w:r>
+              <w:rPr>
+                <w:rFonts w:asciiTheme="majorHAnsi" w:hAnsiTheme="majorHAnsi"/>
+              </w:rPr>
+              <w:t>Twistlocks: Buttons on Right joystick head (Bit 0: Lock, Bit 1: Unlock). Telescoping: Buttons on Right joystick head (Bit 2: Retract, Bit 3: Extend). Sideshift: Left joystick X-axis (Sideshift AB) and Right joystick X-axis (Sideshift CD) for independent control and skew adjustment.</w:t>
+            </w:r>
+          </w:p>
+        </w:tc>
+      </w:tr>
+      <w:tr>
+        <w:tc>
+          <w:tcPr>
+            <w:tcW w:w="2785" w:type="dxa"/>
+          </w:tcPr>
+          <w:p>
+            <w:pPr>
+              <w:rPr>
+                <w:rFonts w:asciiTheme="majorHAnsi" w:hAnsiTheme="majorHAnsi"/>
+                <w:color w:val="FF0000"/>
+              </w:rPr>
+            </w:pPr>
+            <w:r>
+              <w:rPr>
+                <w:rFonts w:asciiTheme="majorHAnsi" w:hAnsiTheme="majorHAnsi"/>
               </w:rPr>
               <w:t>Seat</w:t>
             </w:r>
@@ -1829,13 +2107,14 @@
           <w:p>
             <w:pPr>
               <w:rPr>
+                <w:rFonts w:asciiTheme="majorHAnsi" w:hAnsiTheme="majorHAnsi"/>
                 <w:noProof/>
                 <w:color w:val="FF0000"/>
               </w:rPr>
             </w:pPr>
             <w:r>
               <w:rPr>
-                <w:rFonts w:ascii="Calibri" w:hAnsi="Calibri"/>
+                <w:rFonts w:asciiTheme="majorHAnsi" w:hAnsiTheme="majorHAnsi"/>
               </w:rPr>
               <w:t>Ergonomic adjustable seat with independent suspension</w:t>
             </w:r>
@@ -2084,16 +2363,16 @@
     </w:lvl>
   </w:abstractNum>
   <w:abstractNum w:abstractNumId="1" w15:restartNumberingAfterBreak="0">
-    <w:nsid w:val="5BD25011"/>
+    <w:nsid w:val="39A70C5B"/>
     <w:multiLevelType w:val="hybridMultilevel"/>
-    <w:tmpl w:val="4072E0EE"/>
+    <w:tmpl w:val="4A8A1E7A"/>
     <w:lvl w:ilvl="0" w:tplc="04090001">
       <w:start w:val="1"/>
       <w:numFmt w:val="bullet"/>
       <w:lvlText w:val=""/>
       <w:lvlJc w:val="left"/>
       <w:pPr>
-        <w:ind w:left="360" w:hanging="360"/>
+        <w:ind w:left="720" w:hanging="360"/>
       </w:pPr>
       <w:rPr>
         <w:rFonts w:ascii="Symbol" w:hAnsi="Symbol" w:hint="default"/>
@@ -2105,7 +2384,7 @@
       <w:lvlText w:val="o"/>
       <w:lvlJc w:val="left"/>
       <w:pPr>
-        <w:ind w:left="1080" w:hanging="360"/>
+        <w:ind w:left="1440" w:hanging="360"/>
       </w:pPr>
       <w:rPr>
         <w:rFonts w:ascii="Courier New" w:hAnsi="Courier New" w:cs="Courier New" w:hint="default"/>
@@ -2117,7 +2396,7 @@
       <w:lvlText w:val=""/>
       <w:lvlJc w:val="left"/>
       <w:pPr>
-        <w:ind w:left="1800" w:hanging="360"/>
+        <w:ind w:left="2160" w:hanging="360"/>
       </w:pPr>
       <w:rPr>
         <w:rFonts w:ascii="Wingdings" w:hAnsi="Wingdings" w:hint="default"/>
@@ -2129,7 +2408,7 @@
       <w:lvlText w:val=""/>
       <w:lvlJc w:val="left"/>
       <w:pPr>
-        <w:ind w:left="2520" w:hanging="360"/>
+        <w:ind w:left="2880" w:hanging="360"/>
       </w:pPr>
       <w:rPr>
         <w:rFonts w:ascii="Symbol" w:hAnsi="Symbol" w:hint="default"/>
@@ -2141,7 +2420,7 @@
       <w:lvlText w:val="o"/>
       <w:lvlJc w:val="left"/>
       <w:pPr>
-        <w:ind w:left="3240" w:hanging="360"/>
+        <w:ind w:left="3600" w:hanging="360"/>
       </w:pPr>
       <w:rPr>
         <w:rFonts w:ascii="Courier New" w:hAnsi="Courier New" w:cs="Courier New" w:hint="default"/>
@@ -2153,7 +2432,7 @@
       <w:lvlText w:val=""/>
       <w:lvlJc w:val="left"/>
       <w:pPr>
-        <w:ind w:left="3960" w:hanging="360"/>
+        <w:ind w:left="4320" w:hanging="360"/>
       </w:pPr>
       <w:rPr>
         <w:rFonts w:ascii="Wingdings" w:hAnsi="Wingdings" w:hint="default"/>
@@ -2165,7 +2444,7 @@
       <w:lvlText w:val=""/>
       <w:lvlJc w:val="left"/>
       <w:pPr>
-        <w:ind w:left="4680" w:hanging="360"/>
+        <w:ind w:left="5040" w:hanging="360"/>
       </w:pPr>
       <w:rPr>
         <w:rFonts w:ascii="Symbol" w:hAnsi="Symbol" w:hint="default"/>
@@ -2177,7 +2456,7 @@
       <w:lvlText w:val="o"/>
       <w:lvlJc w:val="left"/>
       <w:pPr>
-        <w:ind w:left="5400" w:hanging="360"/>
+        <w:ind w:left="5760" w:hanging="360"/>
       </w:pPr>
       <w:rPr>
         <w:rFonts w:ascii="Courier New" w:hAnsi="Courier New" w:cs="Courier New" w:hint="default"/>
@@ -2189,6 +2468,119 @@
       <w:lvlText w:val=""/>
       <w:lvlJc w:val="left"/>
       <w:pPr>
+        <w:ind w:left="6480" w:hanging="360"/>
+      </w:pPr>
+      <w:rPr>
+        <w:rFonts w:ascii="Wingdings" w:hAnsi="Wingdings" w:hint="default"/>
+      </w:rPr>
+    </w:lvl>
+  </w:abstractNum>
+  <w:abstractNum w:abstractNumId="2" w15:restartNumberingAfterBreak="0">
+    <w:nsid w:val="5BD25011"/>
+    <w:multiLevelType w:val="hybridMultilevel"/>
+    <w:tmpl w:val="4072E0EE"/>
+    <w:lvl w:ilvl="0" w:tplc="04090001">
+      <w:start w:val="1"/>
+      <w:numFmt w:val="bullet"/>
+      <w:lvlText w:val=""/>
+      <w:lvlJc w:val="left"/>
+      <w:pPr>
+        <w:ind w:left="360" w:hanging="360"/>
+      </w:pPr>
+      <w:rPr>
+        <w:rFonts w:ascii="Symbol" w:hAnsi="Symbol" w:hint="default"/>
+      </w:rPr>
+    </w:lvl>
+    <w:lvl w:ilvl="1" w:tplc="04090003" w:tentative="1">
+      <w:start w:val="1"/>
+      <w:numFmt w:val="bullet"/>
+      <w:lvlText w:val="o"/>
+      <w:lvlJc w:val="left"/>
+      <w:pPr>
+        <w:ind w:left="1080" w:hanging="360"/>
+      </w:pPr>
+      <w:rPr>
+        <w:rFonts w:ascii="Courier New" w:hAnsi="Courier New" w:cs="Courier New" w:hint="default"/>
+      </w:rPr>
+    </w:lvl>
+    <w:lvl w:ilvl="2" w:tplc="04090005" w:tentative="1">
+      <w:start w:val="1"/>
+      <w:numFmt w:val="bullet"/>
+      <w:lvlText w:val=""/>
+      <w:lvlJc w:val="left"/>
+      <w:pPr>
+        <w:ind w:left="1800" w:hanging="360"/>
+      </w:pPr>
+      <w:rPr>
+        <w:rFonts w:ascii="Wingdings" w:hAnsi="Wingdings" w:hint="default"/>
+      </w:rPr>
+    </w:lvl>
+    <w:lvl w:ilvl="3" w:tplc="04090001" w:tentative="1">
+      <w:start w:val="1"/>
+      <w:numFmt w:val="bullet"/>
+      <w:lvlText w:val=""/>
+      <w:lvlJc w:val="left"/>
+      <w:pPr>
+        <w:ind w:left="2520" w:hanging="360"/>
+      </w:pPr>
+      <w:rPr>
+        <w:rFonts w:ascii="Symbol" w:hAnsi="Symbol" w:hint="default"/>
+      </w:rPr>
+    </w:lvl>
+    <w:lvl w:ilvl="4" w:tplc="04090003" w:tentative="1">
+      <w:start w:val="1"/>
+      <w:numFmt w:val="bullet"/>
+      <w:lvlText w:val="o"/>
+      <w:lvlJc w:val="left"/>
+      <w:pPr>
+        <w:ind w:left="3240" w:hanging="360"/>
+      </w:pPr>
+      <w:rPr>
+        <w:rFonts w:ascii="Courier New" w:hAnsi="Courier New" w:cs="Courier New" w:hint="default"/>
+      </w:rPr>
+    </w:lvl>
+    <w:lvl w:ilvl="5" w:tplc="04090005" w:tentative="1">
+      <w:start w:val="1"/>
+      <w:numFmt w:val="bullet"/>
+      <w:lvlText w:val=""/>
+      <w:lvlJc w:val="left"/>
+      <w:pPr>
+        <w:ind w:left="3960" w:hanging="360"/>
+      </w:pPr>
+      <w:rPr>
+        <w:rFonts w:ascii="Wingdings" w:hAnsi="Wingdings" w:hint="default"/>
+      </w:rPr>
+    </w:lvl>
+    <w:lvl w:ilvl="6" w:tplc="04090001" w:tentative="1">
+      <w:start w:val="1"/>
+      <w:numFmt w:val="bullet"/>
+      <w:lvlText w:val=""/>
+      <w:lvlJc w:val="left"/>
+      <w:pPr>
+        <w:ind w:left="4680" w:hanging="360"/>
+      </w:pPr>
+      <w:rPr>
+        <w:rFonts w:ascii="Symbol" w:hAnsi="Symbol" w:hint="default"/>
+      </w:rPr>
+    </w:lvl>
+    <w:lvl w:ilvl="7" w:tplc="04090003" w:tentative="1">
+      <w:start w:val="1"/>
+      <w:numFmt w:val="bullet"/>
+      <w:lvlText w:val="o"/>
+      <w:lvlJc w:val="left"/>
+      <w:pPr>
+        <w:ind w:left="5400" w:hanging="360"/>
+      </w:pPr>
+      <w:rPr>
+        <w:rFonts w:ascii="Courier New" w:hAnsi="Courier New" w:cs="Courier New" w:hint="default"/>
+      </w:rPr>
+    </w:lvl>
+    <w:lvl w:ilvl="8" w:tplc="04090005" w:tentative="1">
+      <w:start w:val="1"/>
+      <w:numFmt w:val="bullet"/>
+      <w:lvlText w:val=""/>
+      <w:lvlJc w:val="left"/>
+      <w:pPr>
         <w:ind w:left="6120" w:hanging="360"/>
       </w:pPr>
       <w:rPr>
@@ -2200,6 +2592,9 @@
     <w:abstractNumId w:val="0"/>
   </w:num>
   <w:num w:numId="2" w16cid:durableId="714622899">
+    <w:abstractNumId w:val="2"/>
+  </w:num>
+  <w:num w:numId="3" w16cid:durableId="2144272444">
     <w:abstractNumId w:val="1"/>
   </w:num>
 </w:numbering>

</xml_diff>

<commit_message>
feat: add battery thermal management system specification row to spec doc
</commit_message>
<xml_diff>
--- a/docs/Spec/Isoloader MJ35 Specifications-v2.docx
+++ b/docs/Spec/Isoloader MJ35 Specifications-v2.docx
@@ -1114,6 +1114,38 @@
                 <w:rFonts w:asciiTheme="majorHAnsi" w:hAnsiTheme="majorHAnsi"/>
               </w:rPr>
               <w:t>CATL, 130 VDC nominal (114.52 kWh total capacity, 2x 57.26 kWh packs in series; designed for minimum 8 hours of continuous operation on a single charge under typical duty cycles)</w:t>
+            </w:r>
+          </w:p>
+        </w:tc>
+      </w:tr>
+      <w:tr>
+        <w:tc>
+          <w:tcPr>
+            <w:tcW w:w="2785" w:type="dxa"/>
+          </w:tcPr>
+          <w:p>
+            <w:r/>
+            <w:r>
+              <w:rPr>
+                <w:rFonts w:ascii="Calibri" w:hAnsi="Calibri"/>
+                <w:b/>
+              </w:rPr>
+              <w:t>Battery Thermal Management</w:t>
+            </w:r>
+          </w:p>
+        </w:tc>
+        <w:tc>
+          <w:tcPr>
+            <w:tcW w:w="8005" w:type="dxa"/>
+          </w:tcPr>
+          <w:p>
+            <w:r/>
+            <w:r>
+              <w:rPr>
+                <w:rFonts w:ascii="Calibri" w:hAnsi="Calibri"/>
+                <w:b w:val="0"/>
+              </w:rPr>
+              <w:t>Active liquid thermal management system (BTMS) equipped with a dedicated chiller (for cooling), electric coolant heater (for heating/pre-conditioning), and a continuous circulation pump to regulate battery cell temperatures within optimal operating ranges.</w:t>
             </w:r>
           </w:p>
         </w:tc>

</xml_diff>